<commit_message>
feat: relance pipeline avec donnees enrichies binome (35 features, test mai2024-avr2025)
- features.parquet mis a jour : 35 features (flux transfrontaliers, TTF, charbon, nuclear_avail_ratio, CSS/CDS)
- 4 modeles : Naif A, RF sans meteo B, RF avec meteo C, XGBoost D
- Resultats : RF (B/C) MAE ~16.9, R2 ~0.78 vs naif MAE 33.1, R2 0.16
- Test DM : RF >> naif (p<0.001) ; meteo non significative vs RF seul (p=0.57)
- Notebook 03_modelling reecrit et execute avec 4 modeles + DM tests + MAE mensuel
- Rapport Word mis a jour : ablation, DM tests, interpretation resultats

Co-Authored-By: Claude Sonnet 4.6 <noreply@anthropic.com>
</commit_message>
<xml_diff>
--- a/outputs/Modelling_Report_French_Power_Prices.docx
+++ b/outputs/Modelling_Report_French_Power_Prices.docx
@@ -15,7 +15,7 @@
           <w:sz w:val="40"/>
           <w:szCs w:val="40"/>
         </w:rPr>
-        <w:t xml:space="preserve">MODELLING REPORT</w:t>
+        <w:t xml:space="preserve">RAPPORT DE MODELISATION</w:t>
       </w:r>
     </w:p>
     <w:p>
@@ -29,12 +29,12 @@
           <w:sz w:val="28"/>
           <w:szCs w:val="28"/>
         </w:rPr>
-        <w:t xml:space="preserve">Day-Ahead French Power Price Forecasting</w:t>
-      </w:r>
-    </w:p>
-    <w:p>
-      <w:pPr>
-        <w:spacing w:after="300" w:before="0"/>
+        <w:t xml:space="preserve">Prevision des Prix Day-Ahead de l'Electricite Francaise</w:t>
+      </w:r>
+    </w:p>
+    <w:p>
+      <w:pPr>
+        <w:spacing w:after="60" w:before="0"/>
         <w:jc w:val="center"/>
       </w:pPr>
       <w:r>
@@ -45,7 +45,23 @@
           <w:sz w:val="20"/>
           <w:szCs w:val="20"/>
         </w:rPr>
-        <w:t xml:space="preserve">EDHEC MSc Data Analysis &amp; AI  —  Master's Thesis</w:t>
+        <w:t xml:space="preserve">EDHEC MSc Data Analysis &amp; AI  --  Memoire de Master</w:t>
+      </w:r>
+    </w:p>
+    <w:p>
+      <w:pPr>
+        <w:spacing w:after="300" w:before="0"/>
+        <w:jc w:val="center"/>
+      </w:pPr>
+      <w:r>
+        <w:rPr>
+          <w:i/>
+          <w:iCs/>
+          <w:color w:val="999999"/>
+          <w:sz w:val="18"/>
+          <w:szCs w:val="18"/>
+        </w:rPr>
+        <w:t xml:space="preserve">Periode de test : mai 2024 - avril 2025 | Sources : ENTSO-E, ERA5, ENTSOE-py, Yahoo Finance</w:t>
       </w:r>
     </w:p>
     <w:p>
@@ -69,7 +85,7 @@
           <w:sz w:val="28"/>
           <w:szCs w:val="28"/>
         </w:rPr>
-        <w:t xml:space="preserve">1. Methodology</w:t>
+        <w:t xml:space="preserve">1. Methodologie</w:t>
       </w:r>
     </w:p>
     <w:p>
@@ -85,7 +101,7 @@
           <w:sz w:val="24"/>
           <w:szCs w:val="24"/>
         </w:rPr>
-        <w:t xml:space="preserve">1.1 Problem Formulation</w:t>
+        <w:t xml:space="preserve">1.1 Formulation du probleme</w:t>
       </w:r>
     </w:p>
     <w:p>
@@ -97,7 +113,7 @@
           <w:sz w:val="22"/>
           <w:szCs w:val="22"/>
         </w:rPr>
-        <w:t xml:space="preserve">The objective is to forecast the French day-ahead electricity price (EPEX SPOT France) for each hour of the next day, using information available before the market gate closure (~12:00 CET). This is a supervised regression problem on a time series with strong seasonal structure.</w:t>
+        <w:t xml:space="preserve">L'objectif est de prevoir le prix day-ahead de l'electricite francaise (EPEX SPOT France) pour chaque heure du lendemain, en utilisant uniquement les informations disponibles avant la cloture du marche (~12h00 CET). Il s'agit d'un probleme de regression supervise sur serie temporelle a forte structure saisonniere, avec des prix variant de -100 a +3000 EUR/MWh selon les conditions de marche.</w:t>
       </w:r>
     </w:p>
     <w:p>
@@ -113,19 +129,7 @@
           <w:sz w:val="24"/>
           <w:szCs w:val="24"/>
         </w:rPr>
-        <w:t xml:space="preserve">1.2 Feature Engineering</w:t>
-      </w:r>
-    </w:p>
-    <w:p>
-      <w:pPr>
-        <w:spacing w:after="100" w:before="80"/>
-      </w:pPr>
-      <w:r>
-        <w:rPr>
-          <w:sz w:val="22"/>
-          <w:szCs w:val="22"/>
-        </w:rPr>
-        <w:t xml:space="preserve">28 features were constructed from four data sources:</w:t>
+        <w:t xml:space="preserve">1.2 Sources de donnees</w:t>
       </w:r>
     </w:p>
     <w:p>
@@ -142,7 +146,7 @@
           <w:sz w:val="22"/>
           <w:szCs w:val="22"/>
         </w:rPr>
-        <w:t xml:space="preserve">Calendar: hour of day (sin/cos encoded), day of week, month (sin/cos encoded), is_weekend</w:t>
+        <w:t xml:space="preserve">Prix et fondamentaux electriques : ENTSO-E Transparency Platform (2018-2025)</w:t>
       </w:r>
     </w:p>
     <w:p>
@@ -159,7 +163,7 @@
           <w:sz w:val="22"/>
           <w:szCs w:val="22"/>
         </w:rPr>
-        <w:t xml:space="preserve">Price lags: T-24h, T-48h, T-168h, rolling means (24h, 168h)</w:t>
+        <w:t xml:space="preserve">Meteorologie : ERA5 reanalyse horaire (Copernicus CDS), France moyenne spatiale</w:t>
       </w:r>
     </w:p>
     <w:p>
@@ -176,7 +180,7 @@
           <w:sz w:val="22"/>
           <w:szCs w:val="22"/>
         </w:rPr>
-        <w:t xml:space="preserve">Fundamentals: load forecast, nuclear/wind/solar/gas/hydro generation (MW)</w:t>
+        <w:t xml:space="preserve">Prix combustibles : TTF gaz naturel, EUA carbone, charbon ARA (Yahoo Finance / Reuters)</w:t>
       </w:r>
     </w:p>
     <w:p>
@@ -186,15 +190,20 @@
           <w:ilvl w:val="0"/>
           <w:numId w:val="2"/>
         </w:numPr>
-        <w:spacing w:after="200" w:before="60"/>
+        <w:spacing w:after="60" w:before="60"/>
       </w:pPr>
       <w:r>
         <w:rPr>
           <w:sz w:val="22"/>
           <w:szCs w:val="22"/>
         </w:rPr>
-        <w:t xml:space="preserve">Weather (ERA5): temperature, wind speed, solar radiation, precipitation, HDD, CDD, wind power proxy, Weather Stress Index</w:t>
-      </w:r>
+        <w:t xml:space="preserve">Flux transfrontaliers : echanges France-Allemagne, Espagne, Belgique, Royaume-Uni</w:t>
+      </w:r>
+    </w:p>
+    <w:p>
+      <w:pPr>
+        <w:spacing w:after="100" w:before="80"/>
+      </w:pPr>
     </w:p>
     <w:p>
       <w:pPr>
@@ -209,7 +218,7 @@
           <w:sz w:val="24"/>
           <w:szCs w:val="24"/>
         </w:rPr>
-        <w:t xml:space="preserve">1.3 Train / Test Split</w:t>
+        <w:t xml:space="preserve">1.3 Feature Engineering</w:t>
       </w:r>
     </w:p>
     <w:p>
@@ -221,7 +230,210 @@
           <w:sz w:val="22"/>
           <w:szCs w:val="22"/>
         </w:rPr>
-        <w:t xml:space="preserve">A strict temporal split is used to prevent data leakage. The model is trained on 2018–2023 and evaluated on the full year 2024 (out-of-sample).</w:t>
+        <w:t xml:space="preserve">35 features ont ete construites a partir des quatre sources de donnees :</w:t>
+      </w:r>
+    </w:p>
+    <w:p>
+      <w:pPr>
+        <w:pStyle w:val="ListParagraph"/>
+        <w:numPr>
+          <w:ilvl w:val="0"/>
+          <w:numId w:val="2"/>
+        </w:numPr>
+        <w:spacing w:after="60" w:before="60"/>
+      </w:pPr>
+      <w:r>
+        <w:rPr>
+          <w:sz w:val="22"/>
+          <w:szCs w:val="22"/>
+        </w:rPr>
+        <w:t xml:space="preserve">Calendrier : heure (sin/cos), jour de la semaine, mois (sin/cos), is_weekend</w:t>
+      </w:r>
+    </w:p>
+    <w:p>
+      <w:pPr>
+        <w:pStyle w:val="ListParagraph"/>
+        <w:numPr>
+          <w:ilvl w:val="0"/>
+          <w:numId w:val="2"/>
+        </w:numPr>
+        <w:spacing w:after="60" w:before="60"/>
+      </w:pPr>
+      <w:r>
+        <w:rPr>
+          <w:sz w:val="22"/>
+          <w:szCs w:val="22"/>
+        </w:rPr>
+        <w:t xml:space="preserve">Lags de prix : T-24h, T-48h, T-168h, moyennes glissantes 24h et 168h</w:t>
+      </w:r>
+    </w:p>
+    <w:p>
+      <w:pPr>
+        <w:pStyle w:val="ListParagraph"/>
+        <w:numPr>
+          <w:ilvl w:val="0"/>
+          <w:numId w:val="2"/>
+        </w:numPr>
+        <w:spacing w:after="60" w:before="60"/>
+      </w:pPr>
+      <w:r>
+        <w:rPr>
+          <w:sz w:val="22"/>
+          <w:szCs w:val="22"/>
+        </w:rPr>
+        <w:t xml:space="preserve">Fondamentaux : prevision de charge, generation nucleaire, gaz, hydro (fil+reservoir), solaire, eolien</w:t>
+      </w:r>
+    </w:p>
+    <w:p>
+      <w:pPr>
+        <w:pStyle w:val="ListParagraph"/>
+        <w:numPr>
+          <w:ilvl w:val="0"/>
+          <w:numId w:val="2"/>
+        </w:numPr>
+        <w:spacing w:after="60" w:before="60"/>
+      </w:pPr>
+      <w:r>
+        <w:rPr>
+          <w:sz w:val="22"/>
+          <w:szCs w:val="22"/>
+        </w:rPr>
+        <w:t xml:space="preserve">Flux transfrontaliers nets : FR-DE, FR-ES, FR-GB, FR-BE</w:t>
+      </w:r>
+    </w:p>
+    <w:p>
+      <w:pPr>
+        <w:pStyle w:val="ListParagraph"/>
+        <w:numPr>
+          <w:ilvl w:val="0"/>
+          <w:numId w:val="2"/>
+        </w:numPr>
+        <w:spacing w:after="60" w:before="60"/>
+      </w:pPr>
+      <w:r>
+        <w:rPr>
+          <w:sz w:val="22"/>
+          <w:szCs w:val="22"/>
+        </w:rPr>
+        <w:t xml:space="preserve">Prix combustibles : TTF (EUR/MWh), charbon ARA (EUR/t)</w:t>
+      </w:r>
+    </w:p>
+    <w:p>
+      <w:pPr>
+        <w:pStyle w:val="ListParagraph"/>
+        <w:numPr>
+          <w:ilvl w:val="0"/>
+          <w:numId w:val="2"/>
+        </w:numPr>
+        <w:spacing w:after="60" w:before="60"/>
+      </w:pPr>
+      <w:r>
+        <w:rPr>
+          <w:sz w:val="22"/>
+          <w:szCs w:val="22"/>
+        </w:rPr>
+        <w:t xml:space="preserve">Meteo ERA5 : temperature, vitesse vent, rayonnement solaire, precipitations</w:t>
+      </w:r>
+    </w:p>
+    <w:p>
+      <w:pPr>
+        <w:pStyle w:val="ListParagraph"/>
+        <w:numPr>
+          <w:ilvl w:val="0"/>
+          <w:numId w:val="2"/>
+        </w:numPr>
+        <w:spacing w:after="60" w:before="60"/>
+      </w:pPr>
+      <w:r>
+        <w:rPr>
+          <w:sz w:val="22"/>
+          <w:szCs w:val="22"/>
+        </w:rPr>
+        <w:t xml:space="preserve">Features derivees : HDD (seuil 17C - standard RTE France), CDD, proxy puissance eolienne</w:t>
+      </w:r>
+    </w:p>
+    <w:p>
+      <w:pPr>
+        <w:pStyle w:val="ListParagraph"/>
+        <w:numPr>
+          <w:ilvl w:val="0"/>
+          <w:numId w:val="2"/>
+        </w:numPr>
+        <w:spacing w:after="60" w:before="60"/>
+      </w:pPr>
+      <w:r>
+        <w:rPr>
+          <w:sz w:val="22"/>
+          <w:szCs w:val="22"/>
+        </w:rPr>
+        <w:t xml:space="preserve">Ratio disponibilite nucleaire : gen_nucleaire / 63 000 MW capacite installee (RTE 2023)</w:t>
+      </w:r>
+    </w:p>
+    <w:p>
+      <w:pPr>
+        <w:pStyle w:val="ListParagraph"/>
+        <w:numPr>
+          <w:ilvl w:val="0"/>
+          <w:numId w:val="2"/>
+        </w:numPr>
+        <w:spacing w:after="60" w:before="60"/>
+      </w:pPr>
+      <w:r>
+        <w:rPr>
+          <w:sz w:val="22"/>
+          <w:szCs w:val="22"/>
+        </w:rPr>
+        <w:t xml:space="preserve">Weather Stress Index : HDD / vitesse_vent (stress thermique x defaut eolien)</w:t>
+      </w:r>
+    </w:p>
+    <w:p>
+      <w:pPr>
+        <w:pStyle w:val="ListParagraph"/>
+        <w:numPr>
+          <w:ilvl w:val="0"/>
+          <w:numId w:val="2"/>
+        </w:numPr>
+        <w:spacing w:after="60" w:before="60"/>
+      </w:pPr>
+      <w:r>
+        <w:rPr>
+          <w:sz w:val="22"/>
+          <w:szCs w:val="22"/>
+        </w:rPr>
+        <w:t xml:space="preserve">Clean Spark Spread (CSS) et Clean Dark Spread (CDS)</w:t>
+      </w:r>
+    </w:p>
+    <w:p>
+      <w:pPr>
+        <w:spacing w:after="100" w:before="80"/>
+      </w:pPr>
+    </w:p>
+    <w:p>
+      <w:pPr>
+        <w:pStyle w:val="Heading2"/>
+        <w:spacing w:after="100" w:before="200"/>
+      </w:pPr>
+      <w:r>
+        <w:rPr>
+          <w:b/>
+          <w:bCs/>
+          <w:color w:val="2E5FA3"/>
+          <w:sz w:val="24"/>
+          <w:szCs w:val="24"/>
+        </w:rPr>
+        <w:t xml:space="preserve">1.4 Split Train / Test</w:t>
+      </w:r>
+    </w:p>
+    <w:p>
+      <w:pPr>
+        <w:spacing w:after="100" w:before="80"/>
+      </w:pPr>
+      <w:r>
+        <w:rPr>
+          <w:sz w:val="22"/>
+          <w:szCs w:val="22"/>
+        </w:rPr>
+        <w:t xml:space="preserve">Un split temporel strict est utilise pour eviter toute fuite de donnees (data leakage). Le modele est entraine sur 2018-2024 et evalue sur les 12 derniers mois (hors-echantillon strict).</w:t>
       </w:r>
     </w:p>
     <w:p>
@@ -276,7 +488,7 @@
                 <w:sz w:val="20"/>
                 <w:szCs w:val="20"/>
               </w:rPr>
-              <w:t xml:space="preserve">Set</w:t>
+              <w:t xml:space="preserve">Ensemble</w:t>
             </w:r>
           </w:p>
         </w:tc>
@@ -309,7 +521,7 @@
                 <w:sz w:val="20"/>
                 <w:szCs w:val="20"/>
               </w:rPr>
-              <w:t xml:space="preserve">Period</w:t>
+              <w:t xml:space="preserve">Periode</w:t>
             </w:r>
           </w:p>
         </w:tc>
@@ -342,7 +554,7 @@
                 <w:sz w:val="20"/>
                 <w:szCs w:val="20"/>
               </w:rPr>
-              <w:t xml:space="preserve">Hours</w:t>
+              <w:t xml:space="preserve">Heures</w:t>
             </w:r>
           </w:p>
         </w:tc>
@@ -377,7 +589,7 @@
                 <w:sz w:val="20"/>
                 <w:szCs w:val="20"/>
               </w:rPr>
-              <w:t xml:space="preserve">Training</w:t>
+              <w:t xml:space="preserve">Entrainement</w:t>
             </w:r>
           </w:p>
         </w:tc>
@@ -410,7 +622,7 @@
                 <w:sz w:val="20"/>
                 <w:szCs w:val="20"/>
               </w:rPr>
-              <w:t xml:space="preserve">Jan 2018 — Dec 2023</w:t>
+              <w:t xml:space="preserve">Janv. 2018 - Avr. 2024</w:t>
             </w:r>
           </w:p>
         </w:tc>
@@ -443,7 +655,7 @@
                 <w:sz w:val="20"/>
                 <w:szCs w:val="20"/>
               </w:rPr>
-              <w:t xml:space="preserve">~52,500</w:t>
+              <w:t xml:space="preserve">~55 200</w:t>
             </w:r>
           </w:p>
         </w:tc>
@@ -478,7 +690,7 @@
                 <w:sz w:val="20"/>
                 <w:szCs w:val="20"/>
               </w:rPr>
-              <w:t xml:space="preserve">Test (out-of-sample)</w:t>
+              <w:t xml:space="preserve">Test (hors-echantillon)</w:t>
             </w:r>
           </w:p>
         </w:tc>
@@ -511,7 +723,7 @@
                 <w:sz w:val="20"/>
                 <w:szCs w:val="20"/>
               </w:rPr>
-              <w:t xml:space="preserve">Jan 2024 — Dec 2024</w:t>
+              <w:t xml:space="preserve">Mai 2024 - Avr. 2025</w:t>
             </w:r>
           </w:p>
         </w:tc>
@@ -544,7 +756,7 @@
                 <w:sz w:val="20"/>
                 <w:szCs w:val="20"/>
               </w:rPr>
-              <w:t xml:space="preserve">~8,700</w:t>
+              <w:t xml:space="preserve">8 640</w:t>
             </w:r>
           </w:p>
         </w:tc>
@@ -568,7 +780,7 @@
           <w:sz w:val="28"/>
           <w:szCs w:val="28"/>
         </w:rPr>
-        <w:t xml:space="preserve">2. Models</w:t>
+        <w:t xml:space="preserve">2. Modeles</w:t>
       </w:r>
     </w:p>
     <w:p>
@@ -584,7 +796,7 @@
           <w:sz w:val="24"/>
           <w:szCs w:val="24"/>
         </w:rPr>
-        <w:t xml:space="preserve">2.1 Naive Benchmark</w:t>
+        <w:t xml:space="preserve">Modele A -- Benchmark naif (lag-168h)</w:t>
       </w:r>
     </w:p>
     <w:p>
@@ -596,7 +808,7 @@
           <w:sz w:val="22"/>
           <w:szCs w:val="22"/>
         </w:rPr>
-        <w:t xml:space="preserve">The naive model predicts the price at hour h on day D+1 as equal to the price at hour h on day D (same-hour previous day). This simple benchmark captures the strong 24h autocorrelation but ignores all other information. It serves as the minimum performance bar any model must beat.</w:t>
+        <w:t xml:space="preserve">Le modele naif predit le prix a l'heure h du jour D+1 egal au prix de l'heure h de la semaine precedente (D-7). Ce benchmark capture la saisonnalite hebdomadaire des prix, plus forte que la saisonnalite journaliere. Il constitue la barre minimale de performance que tout modele doit depasser.</w:t>
       </w:r>
     </w:p>
     <w:p>
@@ -612,7 +824,7 @@
           <w:sz w:val="24"/>
           <w:szCs w:val="24"/>
         </w:rPr>
-        <w:t xml:space="preserve">2.2 Random Forest</w:t>
+        <w:t xml:space="preserve">Modele B -- Random Forest sans meteo (ablation)</w:t>
       </w:r>
     </w:p>
     <w:p>
@@ -624,7 +836,7 @@
           <w:sz w:val="22"/>
           <w:szCs w:val="22"/>
         </w:rPr>
-        <w:t xml:space="preserve">A Random Forest regressor (500 trees, max depth 10, min samples leaf 5) is trained on the full feature matrix. Random Forests are well-suited to electricity price forecasting because they handle non-linear interactions between weather and calendar variables without manual specification, are robust to outliers, and provide built-in feature importance measures. The ensemble approach also reduces variance compared to individual decision trees.</w:t>
+        <w:t xml:space="preserve">Un Random Forest (500 arbres, profondeur max. 10, min. 5 obs. par feuille) est entraine sans aucune feature meteorologique. Ce modele d'ablation permet de mesurer la valeur ajoutee de la meteo par rapport aux seuls fondamentaux de marche et lags de prix.</w:t>
       </w:r>
     </w:p>
     <w:p>
@@ -640,7 +852,7 @@
           <w:sz w:val="24"/>
           <w:szCs w:val="24"/>
         </w:rPr>
-        <w:t xml:space="preserve">2.3 XGBoost</w:t>
+        <w:t xml:space="preserve">Modele C -- Random Forest avec meteo (modele principal)</w:t>
       </w:r>
     </w:p>
     <w:p>
@@ -652,7 +864,35 @@
           <w:sz w:val="22"/>
           <w:szCs w:val="22"/>
         </w:rPr>
-        <w:t xml:space="preserve">An XGBoost gradient-boosted tree model (500 estimators, learning rate 0.05, max depth 6, subsample 0.8) is trained as an alternative to the Random Forest. XGBoost typically performs comparably or better on tabular data due to its sequential error-correction mechanism and built-in regularisation (L1/L2).</w:t>
+        <w:t xml:space="preserve">Le meme Random Forest entraine sur la matrice de features complete (35 variables incluant temperature, vent, HDD, WSI, etc.). Le Random Forest gere naturellement les interactions non-lineaires entre meteo et calendrier sans specification manuelle, est robuste aux outliers de prix, et fournit des importances de features interpretables.</w:t>
+      </w:r>
+    </w:p>
+    <w:p>
+      <w:pPr>
+        <w:pStyle w:val="Heading2"/>
+        <w:spacing w:after="100" w:before="200"/>
+      </w:pPr>
+      <w:r>
+        <w:rPr>
+          <w:b/>
+          <w:bCs/>
+          <w:color w:val="2E5FA3"/>
+          <w:sz w:val="24"/>
+          <w:szCs w:val="24"/>
+        </w:rPr>
+        <w:t xml:space="preserve">Modele D -- XGBoost avec meteo</w:t>
+      </w:r>
+    </w:p>
+    <w:p>
+      <w:pPr>
+        <w:spacing w:after="100" w:before="80"/>
+      </w:pPr>
+      <w:r>
+        <w:rPr>
+          <w:sz w:val="22"/>
+          <w:szCs w:val="22"/>
+        </w:rPr>
+        <w:t xml:space="preserve">Un modele XGBoost (500 estimateurs, taux d'apprentissage 0.05, profondeur 6, subsample 0.8) entraine sur le meme jeu de features que le Modele C. XGBoost exploite un mecanisme de correction d'erreur sequentielle et une regularisation L1/L2 integree, ce qui le rend generalement performant sur les donnees tabulaires.</w:t>
       </w:r>
     </w:p>
     <w:p>
@@ -668,7 +908,7 @@
           <w:sz w:val="28"/>
           <w:szCs w:val="28"/>
         </w:rPr>
-        <w:t xml:space="preserve">3. Results</w:t>
+        <w:t xml:space="preserve">3. Resultats</w:t>
       </w:r>
     </w:p>
     <w:p>
@@ -684,7 +924,7 @@
           <w:sz w:val="24"/>
           <w:szCs w:val="24"/>
         </w:rPr>
-        <w:t xml:space="preserve">3.1 Test Set Performance</w:t>
+        <w:t xml:space="preserve">3.1 Performance sur le jeu de test</w:t>
       </w:r>
     </w:p>
     <w:p>
@@ -696,7 +936,7 @@
           <w:sz w:val="22"/>
           <w:szCs w:val="22"/>
         </w:rPr>
-        <w:t xml:space="preserve">All models are evaluated on the 2024 out-of-sample test set. The table below reports Mean Absolute Error (MAE), Root Mean Square Error (RMSE), and R-squared (R²).</w:t>
+        <w:t xml:space="preserve">Tous les modeles sont evalues sur les 8 640 heures de la periode de test (mai 2024 - avril 2025, entierement hors-echantillon). Les metriques retenues sont le MAE (Mean Absolute Error), RMSE (Root Mean Square Error), sMAPE (Symmetric MAPE, robuste aux prix negatifs), R2 et le Hit Ratio (precision directionnelle).</w:t>
       </w:r>
     </w:p>
     <w:p>
@@ -706,7 +946,7 @@
     </w:p>
     <w:tbl>
       <w:tblPr>
-        <w:tblW w:type="dxa" w:w="9026"/>
+        <w:tblW w:type="dxa" w:w="9500"/>
         <w:tblBorders>
           <w:top w:val="single" w:color="auto" w:sz="4"/>
           <w:left w:val="single" w:color="auto" w:sz="4"/>
@@ -717,15 +957,17 @@
         </w:tblBorders>
       </w:tblPr>
       <w:tblGrid>
-        <w:gridCol w:w="3000"/>
-        <w:gridCol w:w="2000"/>
-        <w:gridCol w:w="2000"/>
-        <w:gridCol w:w="2026"/>
+        <w:gridCol w:w="2800"/>
+        <w:gridCol w:w="1600"/>
+        <w:gridCol w:w="1700"/>
+        <w:gridCol w:w="1500"/>
+        <w:gridCol w:w="900"/>
+        <w:gridCol w:w="1000"/>
       </w:tblGrid>
       <w:tr>
         <w:tc>
           <w:tcPr>
-            <w:tcW w:type="dxa" w:w="3000"/>
+            <w:tcW w:type="dxa" w:w="2800"/>
             <w:tcBorders>
               <w:top w:val="single" w:color="CCCCCC" w:sz="1"/>
               <w:left w:val="single" w:color="CCCCCC" w:sz="1"/>
@@ -752,13 +994,13 @@
                 <w:sz w:val="20"/>
                 <w:szCs w:val="20"/>
               </w:rPr>
-              <w:t xml:space="preserve">Model</w:t>
-            </w:r>
-          </w:p>
-        </w:tc>
-        <w:tc>
-          <w:tcPr>
-            <w:tcW w:type="dxa" w:w="2000"/>
+              <w:t xml:space="preserve">Modele</w:t>
+            </w:r>
+          </w:p>
+        </w:tc>
+        <w:tc>
+          <w:tcPr>
+            <w:tcW w:type="dxa" w:w="1600"/>
             <w:tcBorders>
               <w:top w:val="single" w:color="CCCCCC" w:sz="1"/>
               <w:left w:val="single" w:color="CCCCCC" w:sz="1"/>
@@ -785,13 +1027,13 @@
                 <w:sz w:val="20"/>
                 <w:szCs w:val="20"/>
               </w:rPr>
-              <w:t xml:space="preserve">MAE (€/MWh)</w:t>
-            </w:r>
-          </w:p>
-        </w:tc>
-        <w:tc>
-          <w:tcPr>
-            <w:tcW w:type="dxa" w:w="2000"/>
+              <w:t xml:space="preserve">MAE (EUR/MWh)</w:t>
+            </w:r>
+          </w:p>
+        </w:tc>
+        <w:tc>
+          <w:tcPr>
+            <w:tcW w:type="dxa" w:w="1700"/>
             <w:tcBorders>
               <w:top w:val="single" w:color="CCCCCC" w:sz="1"/>
               <w:left w:val="single" w:color="CCCCCC" w:sz="1"/>
@@ -818,13 +1060,13 @@
                 <w:sz w:val="20"/>
                 <w:szCs w:val="20"/>
               </w:rPr>
-              <w:t xml:space="preserve">RMSE (€/MWh)</w:t>
-            </w:r>
-          </w:p>
-        </w:tc>
-        <w:tc>
-          <w:tcPr>
-            <w:tcW w:type="dxa" w:w="2026"/>
+              <w:t xml:space="preserve">RMSE (EUR/MWh)</w:t>
+            </w:r>
+          </w:p>
+        </w:tc>
+        <w:tc>
+          <w:tcPr>
+            <w:tcW w:type="dxa" w:w="1500"/>
             <w:tcBorders>
               <w:top w:val="single" w:color="CCCCCC" w:sz="1"/>
               <w:left w:val="single" w:color="CCCCCC" w:sz="1"/>
@@ -851,7 +1093,73 @@
                 <w:sz w:val="20"/>
                 <w:szCs w:val="20"/>
               </w:rPr>
-              <w:t xml:space="preserve">R²</w:t>
+              <w:t xml:space="preserve">sMAPE (%)</w:t>
+            </w:r>
+          </w:p>
+        </w:tc>
+        <w:tc>
+          <w:tcPr>
+            <w:tcW w:type="dxa" w:w="900"/>
+            <w:tcBorders>
+              <w:top w:val="single" w:color="CCCCCC" w:sz="1"/>
+              <w:left w:val="single" w:color="CCCCCC" w:sz="1"/>
+              <w:bottom w:val="single" w:color="CCCCCC" w:sz="1"/>
+              <w:right w:val="single" w:color="CCCCCC" w:sz="1"/>
+            </w:tcBorders>
+            <w:shd w:fill="2E5FA3" w:val="clear"/>
+            <w:tcMar>
+              <w:top w:type="dxa" w:w="80"/>
+              <w:left w:type="dxa" w:w="160"/>
+              <w:bottom w:type="dxa" w:w="80"/>
+              <w:right w:type="dxa" w:w="160"/>
+            </w:tcMar>
+          </w:tcPr>
+          <w:p>
+            <w:pPr>
+              <w:jc w:val="center"/>
+            </w:pPr>
+            <w:r>
+              <w:rPr>
+                <w:b/>
+                <w:bCs/>
+                <w:color w:val="FFFFFF"/>
+                <w:sz w:val="20"/>
+                <w:szCs w:val="20"/>
+              </w:rPr>
+              <w:t xml:space="preserve">R2</w:t>
+            </w:r>
+          </w:p>
+        </w:tc>
+        <w:tc>
+          <w:tcPr>
+            <w:tcW w:type="dxa" w:w="1000"/>
+            <w:tcBorders>
+              <w:top w:val="single" w:color="CCCCCC" w:sz="1"/>
+              <w:left w:val="single" w:color="CCCCCC" w:sz="1"/>
+              <w:bottom w:val="single" w:color="CCCCCC" w:sz="1"/>
+              <w:right w:val="single" w:color="CCCCCC" w:sz="1"/>
+            </w:tcBorders>
+            <w:shd w:fill="2E5FA3" w:val="clear"/>
+            <w:tcMar>
+              <w:top w:type="dxa" w:w="80"/>
+              <w:left w:type="dxa" w:w="160"/>
+              <w:bottom w:type="dxa" w:w="80"/>
+              <w:right w:type="dxa" w:w="160"/>
+            </w:tcMar>
+          </w:tcPr>
+          <w:p>
+            <w:pPr>
+              <w:jc w:val="center"/>
+            </w:pPr>
+            <w:r>
+              <w:rPr>
+                <w:b/>
+                <w:bCs/>
+                <w:color w:val="FFFFFF"/>
+                <w:sz w:val="20"/>
+                <w:szCs w:val="20"/>
+              </w:rPr>
+              <w:t xml:space="preserve">Hit (%)</w:t>
             </w:r>
           </w:p>
         </w:tc>
@@ -859,7 +1167,7 @@
       <w:tr>
         <w:tc>
           <w:tcPr>
-            <w:tcW w:type="dxa" w:w="3000"/>
+            <w:tcW w:type="dxa" w:w="2800"/>
             <w:tcBorders>
               <w:top w:val="single" w:color="CCCCCC" w:sz="1"/>
               <w:left w:val="single" w:color="CCCCCC" w:sz="1"/>
@@ -886,13 +1194,13 @@
                 <w:sz w:val="20"/>
                 <w:szCs w:val="20"/>
               </w:rPr>
-              <w:t xml:space="preserve">Naive (benchmark)</w:t>
-            </w:r>
-          </w:p>
-        </w:tc>
-        <w:tc>
-          <w:tcPr>
-            <w:tcW w:type="dxa" w:w="2000"/>
+              <w:t xml:space="preserve">A -- Naif lag-168h</w:t>
+            </w:r>
+          </w:p>
+        </w:tc>
+        <w:tc>
+          <w:tcPr>
+            <w:tcW w:type="dxa" w:w="1600"/>
             <w:tcBorders>
               <w:top w:val="single" w:color="CCCCCC" w:sz="1"/>
               <w:left w:val="single" w:color="CCCCCC" w:sz="1"/>
@@ -919,13 +1227,13 @@
                 <w:sz w:val="20"/>
                 <w:szCs w:val="20"/>
               </w:rPr>
-              <w:t xml:space="preserve">20.37</w:t>
-            </w:r>
-          </w:p>
-        </w:tc>
-        <w:tc>
-          <w:tcPr>
-            <w:tcW w:type="dxa" w:w="2000"/>
+              <w:t xml:space="preserve">33.09</w:t>
+            </w:r>
+          </w:p>
+        </w:tc>
+        <w:tc>
+          <w:tcPr>
+            <w:tcW w:type="dxa" w:w="1700"/>
             <w:tcBorders>
               <w:top w:val="single" w:color="CCCCCC" w:sz="1"/>
               <w:left w:val="single" w:color="CCCCCC" w:sz="1"/>
@@ -952,13 +1260,13 @@
                 <w:sz w:val="20"/>
                 <w:szCs w:val="20"/>
               </w:rPr>
-              <w:t xml:space="preserve">28.37</w:t>
-            </w:r>
-          </w:p>
-        </w:tc>
-        <w:tc>
-          <w:tcPr>
-            <w:tcW w:type="dxa" w:w="2026"/>
+              <w:t xml:space="preserve">44.23</w:t>
+            </w:r>
+          </w:p>
+        </w:tc>
+        <w:tc>
+          <w:tcPr>
+            <w:tcW w:type="dxa" w:w="1500"/>
             <w:tcBorders>
               <w:top w:val="single" w:color="CCCCCC" w:sz="1"/>
               <w:left w:val="single" w:color="CCCCCC" w:sz="1"/>
@@ -985,7 +1293,73 @@
                 <w:sz w:val="20"/>
                 <w:szCs w:val="20"/>
               </w:rPr>
-              <w:t xml:space="preserve">0.514</w:t>
+              <w:t xml:space="preserve">70.9%</w:t>
+            </w:r>
+          </w:p>
+        </w:tc>
+        <w:tc>
+          <w:tcPr>
+            <w:tcW w:type="dxa" w:w="900"/>
+            <w:tcBorders>
+              <w:top w:val="single" w:color="CCCCCC" w:sz="1"/>
+              <w:left w:val="single" w:color="CCCCCC" w:sz="1"/>
+              <w:bottom w:val="single" w:color="CCCCCC" w:sz="1"/>
+              <w:right w:val="single" w:color="CCCCCC" w:sz="1"/>
+            </w:tcBorders>
+            <w:shd w:fill="FFFFFF" w:val="clear"/>
+            <w:tcMar>
+              <w:top w:type="dxa" w:w="80"/>
+              <w:left w:type="dxa" w:w="160"/>
+              <w:bottom w:type="dxa" w:w="80"/>
+              <w:right w:type="dxa" w:w="160"/>
+            </w:tcMar>
+          </w:tcPr>
+          <w:p>
+            <w:pPr>
+              <w:jc w:val="center"/>
+            </w:pPr>
+            <w:r>
+              <w:rPr>
+                <w:b w:val="false"/>
+                <w:bCs w:val="false"/>
+                <w:color w:val="333333"/>
+                <w:sz w:val="20"/>
+                <w:szCs w:val="20"/>
+              </w:rPr>
+              <w:t xml:space="preserve">0.160</w:t>
+            </w:r>
+          </w:p>
+        </w:tc>
+        <w:tc>
+          <w:tcPr>
+            <w:tcW w:type="dxa" w:w="1000"/>
+            <w:tcBorders>
+              <w:top w:val="single" w:color="CCCCCC" w:sz="1"/>
+              <w:left w:val="single" w:color="CCCCCC" w:sz="1"/>
+              <w:bottom w:val="single" w:color="CCCCCC" w:sz="1"/>
+              <w:right w:val="single" w:color="CCCCCC" w:sz="1"/>
+            </w:tcBorders>
+            <w:shd w:fill="FFFFFF" w:val="clear"/>
+            <w:tcMar>
+              <w:top w:type="dxa" w:w="80"/>
+              <w:left w:type="dxa" w:w="160"/>
+              <w:bottom w:type="dxa" w:w="80"/>
+              <w:right w:type="dxa" w:w="160"/>
+            </w:tcMar>
+          </w:tcPr>
+          <w:p>
+            <w:pPr>
+              <w:jc w:val="center"/>
+            </w:pPr>
+            <w:r>
+              <w:rPr>
+                <w:b w:val="false"/>
+                <w:bCs w:val="false"/>
+                <w:color w:val="333333"/>
+                <w:sz w:val="20"/>
+                <w:szCs w:val="20"/>
+              </w:rPr>
+              <w:t xml:space="preserve">59.6%</w:t>
             </w:r>
           </w:p>
         </w:tc>
@@ -993,7 +1367,7 @@
       <w:tr>
         <w:tc>
           <w:tcPr>
-            <w:tcW w:type="dxa" w:w="3000"/>
+            <w:tcW w:type="dxa" w:w="2800"/>
             <w:tcBorders>
               <w:top w:val="single" w:color="CCCCCC" w:sz="1"/>
               <w:left w:val="single" w:color="CCCCCC" w:sz="1"/>
@@ -1020,13 +1394,13 @@
                 <w:sz w:val="20"/>
                 <w:szCs w:val="20"/>
               </w:rPr>
-              <w:t xml:space="preserve">Random Forest</w:t>
-            </w:r>
-          </w:p>
-        </w:tc>
-        <w:tc>
-          <w:tcPr>
-            <w:tcW w:type="dxa" w:w="2000"/>
+              <w:t xml:space="preserve">B -- RF sans meteo</w:t>
+            </w:r>
+          </w:p>
+        </w:tc>
+        <w:tc>
+          <w:tcPr>
+            <w:tcW w:type="dxa" w:w="1600"/>
             <w:tcBorders>
               <w:top w:val="single" w:color="CCCCCC" w:sz="1"/>
               <w:left w:val="single" w:color="CCCCCC" w:sz="1"/>
@@ -1053,13 +1427,13 @@
                 <w:sz w:val="20"/>
                 <w:szCs w:val="20"/>
               </w:rPr>
-              <w:t xml:space="preserve">15.71</w:t>
-            </w:r>
-          </w:p>
-        </w:tc>
-        <w:tc>
-          <w:tcPr>
-            <w:tcW w:type="dxa" w:w="2000"/>
+              <w:t xml:space="preserve">16.95</w:t>
+            </w:r>
+          </w:p>
+        </w:tc>
+        <w:tc>
+          <w:tcPr>
+            <w:tcW w:type="dxa" w:w="1700"/>
             <w:tcBorders>
               <w:top w:val="single" w:color="CCCCCC" w:sz="1"/>
               <w:left w:val="single" w:color="CCCCCC" w:sz="1"/>
@@ -1086,13 +1460,13 @@
                 <w:sz w:val="20"/>
                 <w:szCs w:val="20"/>
               </w:rPr>
-              <w:t xml:space="preserve">20.80</w:t>
-            </w:r>
-          </w:p>
-        </w:tc>
-        <w:tc>
-          <w:tcPr>
-            <w:tcW w:type="dxa" w:w="2026"/>
+              <w:t xml:space="preserve">22.88</w:t>
+            </w:r>
+          </w:p>
+        </w:tc>
+        <w:tc>
+          <w:tcPr>
+            <w:tcW w:type="dxa" w:w="1500"/>
             <w:tcBorders>
               <w:top w:val="single" w:color="CCCCCC" w:sz="1"/>
               <w:left w:val="single" w:color="CCCCCC" w:sz="1"/>
@@ -1119,7 +1493,73 @@
                 <w:sz w:val="20"/>
                 <w:szCs w:val="20"/>
               </w:rPr>
-              <w:t xml:space="preserve">0.739</w:t>
+              <w:t xml:space="preserve">44.2%</w:t>
+            </w:r>
+          </w:p>
+        </w:tc>
+        <w:tc>
+          <w:tcPr>
+            <w:tcW w:type="dxa" w:w="900"/>
+            <w:tcBorders>
+              <w:top w:val="single" w:color="CCCCCC" w:sz="1"/>
+              <w:left w:val="single" w:color="CCCCCC" w:sz="1"/>
+              <w:bottom w:val="single" w:color="CCCCCC" w:sz="1"/>
+              <w:right w:val="single" w:color="CCCCCC" w:sz="1"/>
+            </w:tcBorders>
+            <w:shd w:fill="F0F4FA" w:val="clear"/>
+            <w:tcMar>
+              <w:top w:type="dxa" w:w="80"/>
+              <w:left w:type="dxa" w:w="160"/>
+              <w:bottom w:type="dxa" w:w="80"/>
+              <w:right w:type="dxa" w:w="160"/>
+            </w:tcMar>
+          </w:tcPr>
+          <w:p>
+            <w:pPr>
+              <w:jc w:val="center"/>
+            </w:pPr>
+            <w:r>
+              <w:rPr>
+                <w:b w:val="false"/>
+                <w:bCs w:val="false"/>
+                <w:color w:val="333333"/>
+                <w:sz w:val="20"/>
+                <w:szCs w:val="20"/>
+              </w:rPr>
+              <w:t xml:space="preserve">0.775</w:t>
+            </w:r>
+          </w:p>
+        </w:tc>
+        <w:tc>
+          <w:tcPr>
+            <w:tcW w:type="dxa" w:w="1000"/>
+            <w:tcBorders>
+              <w:top w:val="single" w:color="CCCCCC" w:sz="1"/>
+              <w:left w:val="single" w:color="CCCCCC" w:sz="1"/>
+              <w:bottom w:val="single" w:color="CCCCCC" w:sz="1"/>
+              <w:right w:val="single" w:color="CCCCCC" w:sz="1"/>
+            </w:tcBorders>
+            <w:shd w:fill="F0F4FA" w:val="clear"/>
+            <w:tcMar>
+              <w:top w:type="dxa" w:w="80"/>
+              <w:left w:type="dxa" w:w="160"/>
+              <w:bottom w:type="dxa" w:w="80"/>
+              <w:right w:type="dxa" w:w="160"/>
+            </w:tcMar>
+          </w:tcPr>
+          <w:p>
+            <w:pPr>
+              <w:jc w:val="center"/>
+            </w:pPr>
+            <w:r>
+              <w:rPr>
+                <w:b w:val="false"/>
+                <w:bCs w:val="false"/>
+                <w:color w:val="333333"/>
+                <w:sz w:val="20"/>
+                <w:szCs w:val="20"/>
+              </w:rPr>
+              <w:t xml:space="preserve">65.5%</w:t>
             </w:r>
           </w:p>
         </w:tc>
@@ -1127,7 +1567,7 @@
       <w:tr>
         <w:tc>
           <w:tcPr>
-            <w:tcW w:type="dxa" w:w="3000"/>
+            <w:tcW w:type="dxa" w:w="2800"/>
             <w:tcBorders>
               <w:top w:val="single" w:color="CCCCCC" w:sz="1"/>
               <w:left w:val="single" w:color="CCCCCC" w:sz="1"/>
@@ -1154,13 +1594,13 @@
                 <w:sz w:val="20"/>
                 <w:szCs w:val="20"/>
               </w:rPr>
-              <w:t xml:space="preserve">XGBoost</w:t>
-            </w:r>
-          </w:p>
-        </w:tc>
-        <w:tc>
-          <w:tcPr>
-            <w:tcW w:type="dxa" w:w="2000"/>
+              <w:t xml:space="preserve">C -- RF avec meteo</w:t>
+            </w:r>
+          </w:p>
+        </w:tc>
+        <w:tc>
+          <w:tcPr>
+            <w:tcW w:type="dxa" w:w="1600"/>
             <w:tcBorders>
               <w:top w:val="single" w:color="CCCCCC" w:sz="1"/>
               <w:left w:val="single" w:color="CCCCCC" w:sz="1"/>
@@ -1187,13 +1627,13 @@
                 <w:sz w:val="20"/>
                 <w:szCs w:val="20"/>
               </w:rPr>
-              <w:t xml:space="preserve">15.36</w:t>
-            </w:r>
-          </w:p>
-        </w:tc>
-        <w:tc>
-          <w:tcPr>
-            <w:tcW w:type="dxa" w:w="2000"/>
+              <w:t xml:space="preserve">16.94</w:t>
+            </w:r>
+          </w:p>
+        </w:tc>
+        <w:tc>
+          <w:tcPr>
+            <w:tcW w:type="dxa" w:w="1700"/>
             <w:tcBorders>
               <w:top w:val="single" w:color="CCCCCC" w:sz="1"/>
               <w:left w:val="single" w:color="CCCCCC" w:sz="1"/>
@@ -1220,13 +1660,13 @@
                 <w:sz w:val="20"/>
                 <w:szCs w:val="20"/>
               </w:rPr>
-              <w:t xml:space="preserve">20.11</w:t>
-            </w:r>
-          </w:p>
-        </w:tc>
-        <w:tc>
-          <w:tcPr>
-            <w:tcW w:type="dxa" w:w="2026"/>
+              <w:t xml:space="preserve">22.85</w:t>
+            </w:r>
+          </w:p>
+        </w:tc>
+        <w:tc>
+          <w:tcPr>
+            <w:tcW w:type="dxa" w:w="1500"/>
             <w:tcBorders>
               <w:top w:val="single" w:color="CCCCCC" w:sz="1"/>
               <w:left w:val="single" w:color="CCCCCC" w:sz="1"/>
@@ -1253,7 +1693,273 @@
                 <w:sz w:val="20"/>
                 <w:szCs w:val="20"/>
               </w:rPr>
-              <w:t xml:space="preserve">0.756</w:t>
+              <w:t xml:space="preserve">44.2%</w:t>
+            </w:r>
+          </w:p>
+        </w:tc>
+        <w:tc>
+          <w:tcPr>
+            <w:tcW w:type="dxa" w:w="900"/>
+            <w:tcBorders>
+              <w:top w:val="single" w:color="CCCCCC" w:sz="1"/>
+              <w:left w:val="single" w:color="CCCCCC" w:sz="1"/>
+              <w:bottom w:val="single" w:color="CCCCCC" w:sz="1"/>
+              <w:right w:val="single" w:color="CCCCCC" w:sz="1"/>
+            </w:tcBorders>
+            <w:shd w:fill="FFFFFF" w:val="clear"/>
+            <w:tcMar>
+              <w:top w:type="dxa" w:w="80"/>
+              <w:left w:type="dxa" w:w="160"/>
+              <w:bottom w:type="dxa" w:w="80"/>
+              <w:right w:type="dxa" w:w="160"/>
+            </w:tcMar>
+          </w:tcPr>
+          <w:p>
+            <w:pPr>
+              <w:jc w:val="center"/>
+            </w:pPr>
+            <w:r>
+              <w:rPr>
+                <w:b w:val="false"/>
+                <w:bCs w:val="false"/>
+                <w:color w:val="333333"/>
+                <w:sz w:val="20"/>
+                <w:szCs w:val="20"/>
+              </w:rPr>
+              <w:t xml:space="preserve">0.776</w:t>
+            </w:r>
+          </w:p>
+        </w:tc>
+        <w:tc>
+          <w:tcPr>
+            <w:tcW w:type="dxa" w:w="1000"/>
+            <w:tcBorders>
+              <w:top w:val="single" w:color="CCCCCC" w:sz="1"/>
+              <w:left w:val="single" w:color="CCCCCC" w:sz="1"/>
+              <w:bottom w:val="single" w:color="CCCCCC" w:sz="1"/>
+              <w:right w:val="single" w:color="CCCCCC" w:sz="1"/>
+            </w:tcBorders>
+            <w:shd w:fill="FFFFFF" w:val="clear"/>
+            <w:tcMar>
+              <w:top w:type="dxa" w:w="80"/>
+              <w:left w:type="dxa" w:w="160"/>
+              <w:bottom w:type="dxa" w:w="80"/>
+              <w:right w:type="dxa" w:w="160"/>
+            </w:tcMar>
+          </w:tcPr>
+          <w:p>
+            <w:pPr>
+              <w:jc w:val="center"/>
+            </w:pPr>
+            <w:r>
+              <w:rPr>
+                <w:b w:val="false"/>
+                <w:bCs w:val="false"/>
+                <w:color w:val="333333"/>
+                <w:sz w:val="20"/>
+                <w:szCs w:val="20"/>
+              </w:rPr>
+              <w:t xml:space="preserve">65.4%</w:t>
+            </w:r>
+          </w:p>
+        </w:tc>
+      </w:tr>
+      <w:tr>
+        <w:tc>
+          <w:tcPr>
+            <w:tcW w:type="dxa" w:w="2800"/>
+            <w:tcBorders>
+              <w:top w:val="single" w:color="CCCCCC" w:sz="1"/>
+              <w:left w:val="single" w:color="CCCCCC" w:sz="1"/>
+              <w:bottom w:val="single" w:color="CCCCCC" w:sz="1"/>
+              <w:right w:val="single" w:color="CCCCCC" w:sz="1"/>
+            </w:tcBorders>
+            <w:shd w:fill="F0F4FA" w:val="clear"/>
+            <w:tcMar>
+              <w:top w:type="dxa" w:w="80"/>
+              <w:left w:type="dxa" w:w="160"/>
+              <w:bottom w:type="dxa" w:w="80"/>
+              <w:right w:type="dxa" w:w="160"/>
+            </w:tcMar>
+          </w:tcPr>
+          <w:p>
+            <w:pPr>
+              <w:jc w:val="left"/>
+            </w:pPr>
+            <w:r>
+              <w:rPr>
+                <w:b w:val="false"/>
+                <w:bCs w:val="false"/>
+                <w:color w:val="333333"/>
+                <w:sz w:val="20"/>
+                <w:szCs w:val="20"/>
+              </w:rPr>
+              <w:t xml:space="preserve">D -- XGBoost avec meteo</w:t>
+            </w:r>
+          </w:p>
+        </w:tc>
+        <w:tc>
+          <w:tcPr>
+            <w:tcW w:type="dxa" w:w="1600"/>
+            <w:tcBorders>
+              <w:top w:val="single" w:color="CCCCCC" w:sz="1"/>
+              <w:left w:val="single" w:color="CCCCCC" w:sz="1"/>
+              <w:bottom w:val="single" w:color="CCCCCC" w:sz="1"/>
+              <w:right w:val="single" w:color="CCCCCC" w:sz="1"/>
+            </w:tcBorders>
+            <w:shd w:fill="F0F4FA" w:val="clear"/>
+            <w:tcMar>
+              <w:top w:type="dxa" w:w="80"/>
+              <w:left w:type="dxa" w:w="160"/>
+              <w:bottom w:type="dxa" w:w="80"/>
+              <w:right w:type="dxa" w:w="160"/>
+            </w:tcMar>
+          </w:tcPr>
+          <w:p>
+            <w:pPr>
+              <w:jc w:val="center"/>
+            </w:pPr>
+            <w:r>
+              <w:rPr>
+                <w:b w:val="false"/>
+                <w:bCs w:val="false"/>
+                <w:color w:val="333333"/>
+                <w:sz w:val="20"/>
+                <w:szCs w:val="20"/>
+              </w:rPr>
+              <w:t xml:space="preserve">19.14</w:t>
+            </w:r>
+          </w:p>
+        </w:tc>
+        <w:tc>
+          <w:tcPr>
+            <w:tcW w:type="dxa" w:w="1700"/>
+            <w:tcBorders>
+              <w:top w:val="single" w:color="CCCCCC" w:sz="1"/>
+              <w:left w:val="single" w:color="CCCCCC" w:sz="1"/>
+              <w:bottom w:val="single" w:color="CCCCCC" w:sz="1"/>
+              <w:right w:val="single" w:color="CCCCCC" w:sz="1"/>
+            </w:tcBorders>
+            <w:shd w:fill="F0F4FA" w:val="clear"/>
+            <w:tcMar>
+              <w:top w:type="dxa" w:w="80"/>
+              <w:left w:type="dxa" w:w="160"/>
+              <w:bottom w:type="dxa" w:w="80"/>
+              <w:right w:type="dxa" w:w="160"/>
+            </w:tcMar>
+          </w:tcPr>
+          <w:p>
+            <w:pPr>
+              <w:jc w:val="center"/>
+            </w:pPr>
+            <w:r>
+              <w:rPr>
+                <w:b w:val="false"/>
+                <w:bCs w:val="false"/>
+                <w:color w:val="333333"/>
+                <w:sz w:val="20"/>
+                <w:szCs w:val="20"/>
+              </w:rPr>
+              <w:t xml:space="preserve">28.18</w:t>
+            </w:r>
+          </w:p>
+        </w:tc>
+        <w:tc>
+          <w:tcPr>
+            <w:tcW w:type="dxa" w:w="1500"/>
+            <w:tcBorders>
+              <w:top w:val="single" w:color="CCCCCC" w:sz="1"/>
+              <w:left w:val="single" w:color="CCCCCC" w:sz="1"/>
+              <w:bottom w:val="single" w:color="CCCCCC" w:sz="1"/>
+              <w:right w:val="single" w:color="CCCCCC" w:sz="1"/>
+            </w:tcBorders>
+            <w:shd w:fill="F0F4FA" w:val="clear"/>
+            <w:tcMar>
+              <w:top w:type="dxa" w:w="80"/>
+              <w:left w:type="dxa" w:w="160"/>
+              <w:bottom w:type="dxa" w:w="80"/>
+              <w:right w:type="dxa" w:w="160"/>
+            </w:tcMar>
+          </w:tcPr>
+          <w:p>
+            <w:pPr>
+              <w:jc w:val="center"/>
+            </w:pPr>
+            <w:r>
+              <w:rPr>
+                <w:b w:val="false"/>
+                <w:bCs w:val="false"/>
+                <w:color w:val="333333"/>
+                <w:sz w:val="20"/>
+                <w:szCs w:val="20"/>
+              </w:rPr>
+              <w:t xml:space="preserve">45.4%</w:t>
+            </w:r>
+          </w:p>
+        </w:tc>
+        <w:tc>
+          <w:tcPr>
+            <w:tcW w:type="dxa" w:w="900"/>
+            <w:tcBorders>
+              <w:top w:val="single" w:color="CCCCCC" w:sz="1"/>
+              <w:left w:val="single" w:color="CCCCCC" w:sz="1"/>
+              <w:bottom w:val="single" w:color="CCCCCC" w:sz="1"/>
+              <w:right w:val="single" w:color="CCCCCC" w:sz="1"/>
+            </w:tcBorders>
+            <w:shd w:fill="F0F4FA" w:val="clear"/>
+            <w:tcMar>
+              <w:top w:type="dxa" w:w="80"/>
+              <w:left w:type="dxa" w:w="160"/>
+              <w:bottom w:type="dxa" w:w="80"/>
+              <w:right w:type="dxa" w:w="160"/>
+            </w:tcMar>
+          </w:tcPr>
+          <w:p>
+            <w:pPr>
+              <w:jc w:val="center"/>
+            </w:pPr>
+            <w:r>
+              <w:rPr>
+                <w:b w:val="false"/>
+                <w:bCs w:val="false"/>
+                <w:color w:val="333333"/>
+                <w:sz w:val="20"/>
+                <w:szCs w:val="20"/>
+              </w:rPr>
+              <w:t xml:space="preserve">0.659</w:t>
+            </w:r>
+          </w:p>
+        </w:tc>
+        <w:tc>
+          <w:tcPr>
+            <w:tcW w:type="dxa" w:w="1000"/>
+            <w:tcBorders>
+              <w:top w:val="single" w:color="CCCCCC" w:sz="1"/>
+              <w:left w:val="single" w:color="CCCCCC" w:sz="1"/>
+              <w:bottom w:val="single" w:color="CCCCCC" w:sz="1"/>
+              <w:right w:val="single" w:color="CCCCCC" w:sz="1"/>
+            </w:tcBorders>
+            <w:shd w:fill="F0F4FA" w:val="clear"/>
+            <w:tcMar>
+              <w:top w:type="dxa" w:w="80"/>
+              <w:left w:type="dxa" w:w="160"/>
+              <w:bottom w:type="dxa" w:w="80"/>
+              <w:right w:type="dxa" w:w="160"/>
+            </w:tcMar>
+          </w:tcPr>
+          <w:p>
+            <w:pPr>
+              <w:jc w:val="center"/>
+            </w:pPr>
+            <w:r>
+              <w:rPr>
+                <w:b w:val="false"/>
+                <w:bCs w:val="false"/>
+                <w:color w:val="333333"/>
+                <w:sz w:val="20"/>
+                <w:szCs w:val="20"/>
+              </w:rPr>
+              <w:t xml:space="preserve">65.8%</w:t>
             </w:r>
           </w:p>
         </w:tc>
@@ -1273,7 +1979,7 @@
           <w:sz w:val="22"/>
           <w:szCs w:val="22"/>
         </w:rPr>
-        <w:t xml:space="preserve">Both tree-based models substantially outperform the naive benchmark, reducing MAE by ~25% and improving R² by over 24 percentage points. XGBoost achieves marginally better performance across all metrics (MAE: 15.36 vs 15.71, R²: 0.756 vs 0.739).</w:t>
+        <w:t xml:space="preserve">Les deux Random Forest (B et C) dominent largement le benchmark naif, reduisant le MAE de ~49% (33 vs 17 EUR/MWh) et ameliorant le R2 de 0.16 a 0.78. Fait notable : l'ajout de la meteo (C vs B) n'apporte qu'une amelioration marginale (+0.005 R2), suggere que les flux transfrontaliers, le prix du gaz TTF et la disponibilite nucleaire capturent deja la plupart de la variabilite liee aux conditions climatiques. XGBoost (D) sous-performe les Random Forests avec des hyperparametres standards, indiquant un potentiel de tuning.</w:t>
       </w:r>
     </w:p>
     <w:p>
@@ -1339,7 +2045,7 @@
           <w:sz w:val="18"/>
           <w:szCs w:val="18"/>
         </w:rPr>
-        <w:t xml:space="preserve">Figure 1 — MAE, RMSE, and R² comparison across all models on the 2024 test set.</w:t>
+        <w:t xml:space="preserve">Figure 1 -- MAE, RMSE, R2 et Hit Ratio des quatre modeles sur la periode de test (mai 2024 - avr. 2025).</w:t>
       </w:r>
     </w:p>
     <w:p>
@@ -1360,7 +2066,7 @@
           <w:sz w:val="24"/>
           <w:szCs w:val="24"/>
         </w:rPr>
-        <w:t xml:space="preserve">3.2 Forecast vs Actual</w:t>
+        <w:t xml:space="preserve">3.2 Tests de Diebold-Mariano (HLN 1997)</w:t>
       </w:r>
     </w:p>
     <w:p>
@@ -1372,7 +2078,751 @@
           <w:sz w:val="22"/>
           <w:szCs w:val="22"/>
         </w:rPr>
-        <w:t xml:space="preserve">Figure 2 shows the first month of the test set. Both models track the general price pattern well, including the intra-week structure and daily peaks. Errors are largest during sudden price spikes driven by unforeseeable events (plant outages, gas supply shocks).</w:t>
+        <w:t xml:space="preserve">Le test de Diebold-Mariano (1995) avec correction Harvey-Leybourne-Newbold (1997) evalue si les differences de performance entre modeles sont statistiquement significatives. H0 : accuracy predictive egale entre les deux modeles (MAE-base). Une statistique DM negative signifie que le modele 1 est plus precis.</w:t>
+      </w:r>
+    </w:p>
+    <w:p>
+      <w:pPr>
+        <w:spacing w:after="100" w:before="100"/>
+      </w:pPr>
+    </w:p>
+    <w:tbl>
+      <w:tblPr>
+        <w:tblW w:type="dxa" w:w="7500"/>
+        <w:tblBorders>
+          <w:top w:val="single" w:color="auto" w:sz="4"/>
+          <w:left w:val="single" w:color="auto" w:sz="4"/>
+          <w:bottom w:val="single" w:color="auto" w:sz="4"/>
+          <w:right w:val="single" w:color="auto" w:sz="4"/>
+          <w:insideH w:val="single" w:color="auto" w:sz="4"/>
+          <w:insideV w:val="single" w:color="auto" w:sz="4"/>
+        </w:tblBorders>
+      </w:tblPr>
+      <w:tblGrid>
+        <w:gridCol w:w="3600"/>
+        <w:gridCol w:w="1200"/>
+        <w:gridCol w:w="1200"/>
+        <w:gridCol w:w="1500"/>
+      </w:tblGrid>
+      <w:tr>
+        <w:tc>
+          <w:tcPr>
+            <w:tcW w:type="dxa" w:w="3600"/>
+            <w:tcBorders>
+              <w:top w:val="single" w:color="CCCCCC" w:sz="1"/>
+              <w:left w:val="single" w:color="CCCCCC" w:sz="1"/>
+              <w:bottom w:val="single" w:color="CCCCCC" w:sz="1"/>
+              <w:right w:val="single" w:color="CCCCCC" w:sz="1"/>
+            </w:tcBorders>
+            <w:shd w:fill="1F3864" w:val="clear"/>
+            <w:tcMar>
+              <w:top w:type="dxa" w:w="80"/>
+              <w:left w:type="dxa" w:w="160"/>
+              <w:bottom w:type="dxa" w:w="80"/>
+              <w:right w:type="dxa" w:w="160"/>
+            </w:tcMar>
+          </w:tcPr>
+          <w:p>
+            <w:pPr>
+              <w:jc w:val="left"/>
+            </w:pPr>
+            <w:r>
+              <w:rPr>
+                <w:b/>
+                <w:bCs/>
+                <w:color w:val="FFFFFF"/>
+                <w:sz w:val="20"/>
+                <w:szCs w:val="20"/>
+              </w:rPr>
+              <w:t xml:space="preserve">Comparaison</w:t>
+            </w:r>
+          </w:p>
+        </w:tc>
+        <w:tc>
+          <w:tcPr>
+            <w:tcW w:type="dxa" w:w="1200"/>
+            <w:tcBorders>
+              <w:top w:val="single" w:color="CCCCCC" w:sz="1"/>
+              <w:left w:val="single" w:color="CCCCCC" w:sz="1"/>
+              <w:bottom w:val="single" w:color="CCCCCC" w:sz="1"/>
+              <w:right w:val="single" w:color="CCCCCC" w:sz="1"/>
+            </w:tcBorders>
+            <w:shd w:fill="2E5FA3" w:val="clear"/>
+            <w:tcMar>
+              <w:top w:type="dxa" w:w="80"/>
+              <w:left w:type="dxa" w:w="160"/>
+              <w:bottom w:type="dxa" w:w="80"/>
+              <w:right w:type="dxa" w:w="160"/>
+            </w:tcMar>
+          </w:tcPr>
+          <w:p>
+            <w:pPr>
+              <w:jc w:val="center"/>
+            </w:pPr>
+            <w:r>
+              <w:rPr>
+                <w:b/>
+                <w:bCs/>
+                <w:color w:val="FFFFFF"/>
+                <w:sz w:val="20"/>
+                <w:szCs w:val="20"/>
+              </w:rPr>
+              <w:t xml:space="preserve">Stat. DM</w:t>
+            </w:r>
+          </w:p>
+        </w:tc>
+        <w:tc>
+          <w:tcPr>
+            <w:tcW w:type="dxa" w:w="1200"/>
+            <w:tcBorders>
+              <w:top w:val="single" w:color="CCCCCC" w:sz="1"/>
+              <w:left w:val="single" w:color="CCCCCC" w:sz="1"/>
+              <w:bottom w:val="single" w:color="CCCCCC" w:sz="1"/>
+              <w:right w:val="single" w:color="CCCCCC" w:sz="1"/>
+            </w:tcBorders>
+            <w:shd w:fill="2E5FA3" w:val="clear"/>
+            <w:tcMar>
+              <w:top w:type="dxa" w:w="80"/>
+              <w:left w:type="dxa" w:w="160"/>
+              <w:bottom w:type="dxa" w:w="80"/>
+              <w:right w:type="dxa" w:w="160"/>
+            </w:tcMar>
+          </w:tcPr>
+          <w:p>
+            <w:pPr>
+              <w:jc w:val="center"/>
+            </w:pPr>
+            <w:r>
+              <w:rPr>
+                <w:b/>
+                <w:bCs/>
+                <w:color w:val="FFFFFF"/>
+                <w:sz w:val="20"/>
+                <w:szCs w:val="20"/>
+              </w:rPr>
+              <w:t xml:space="preserve">p-value</w:t>
+            </w:r>
+          </w:p>
+        </w:tc>
+        <w:tc>
+          <w:tcPr>
+            <w:tcW w:type="dxa" w:w="1500"/>
+            <w:tcBorders>
+              <w:top w:val="single" w:color="CCCCCC" w:sz="1"/>
+              <w:left w:val="single" w:color="CCCCCC" w:sz="1"/>
+              <w:bottom w:val="single" w:color="CCCCCC" w:sz="1"/>
+              <w:right w:val="single" w:color="CCCCCC" w:sz="1"/>
+            </w:tcBorders>
+            <w:shd w:fill="2E5FA3" w:val="clear"/>
+            <w:tcMar>
+              <w:top w:type="dxa" w:w="80"/>
+              <w:left w:type="dxa" w:w="160"/>
+              <w:bottom w:type="dxa" w:w="80"/>
+              <w:right w:type="dxa" w:w="160"/>
+            </w:tcMar>
+          </w:tcPr>
+          <w:p>
+            <w:pPr>
+              <w:jc w:val="center"/>
+            </w:pPr>
+            <w:r>
+              <w:rPr>
+                <w:b/>
+                <w:bCs/>
+                <w:color w:val="FFFFFF"/>
+                <w:sz w:val="20"/>
+                <w:szCs w:val="20"/>
+              </w:rPr>
+              <w:t xml:space="preserve">Significativite</w:t>
+            </w:r>
+          </w:p>
+        </w:tc>
+      </w:tr>
+      <w:tr>
+        <w:tc>
+          <w:tcPr>
+            <w:tcW w:type="dxa" w:w="3600"/>
+            <w:tcBorders>
+              <w:top w:val="single" w:color="CCCCCC" w:sz="1"/>
+              <w:left w:val="single" w:color="CCCCCC" w:sz="1"/>
+              <w:bottom w:val="single" w:color="CCCCCC" w:sz="1"/>
+              <w:right w:val="single" w:color="CCCCCC" w:sz="1"/>
+            </w:tcBorders>
+            <w:shd w:fill="FFFFFF" w:val="clear"/>
+            <w:tcMar>
+              <w:top w:type="dxa" w:w="80"/>
+              <w:left w:type="dxa" w:w="160"/>
+              <w:bottom w:type="dxa" w:w="80"/>
+              <w:right w:type="dxa" w:w="160"/>
+            </w:tcMar>
+          </w:tcPr>
+          <w:p>
+            <w:pPr>
+              <w:jc w:val="left"/>
+            </w:pPr>
+            <w:r>
+              <w:rPr>
+                <w:b w:val="false"/>
+                <w:bCs w:val="false"/>
+                <w:color w:val="333333"/>
+                <w:sz w:val="20"/>
+                <w:szCs w:val="20"/>
+              </w:rPr>
+              <w:t xml:space="preserve">C vs B : la meteo apporte-t-elle de la valeur ?</w:t>
+            </w:r>
+          </w:p>
+        </w:tc>
+        <w:tc>
+          <w:tcPr>
+            <w:tcW w:type="dxa" w:w="1200"/>
+            <w:tcBorders>
+              <w:top w:val="single" w:color="CCCCCC" w:sz="1"/>
+              <w:left w:val="single" w:color="CCCCCC" w:sz="1"/>
+              <w:bottom w:val="single" w:color="CCCCCC" w:sz="1"/>
+              <w:right w:val="single" w:color="CCCCCC" w:sz="1"/>
+            </w:tcBorders>
+            <w:shd w:fill="FFFFFF" w:val="clear"/>
+            <w:tcMar>
+              <w:top w:type="dxa" w:w="80"/>
+              <w:left w:type="dxa" w:w="160"/>
+              <w:bottom w:type="dxa" w:w="80"/>
+              <w:right w:type="dxa" w:w="160"/>
+            </w:tcMar>
+          </w:tcPr>
+          <w:p>
+            <w:pPr>
+              <w:jc w:val="center"/>
+            </w:pPr>
+            <w:r>
+              <w:rPr>
+                <w:b w:val="false"/>
+                <w:bCs w:val="false"/>
+                <w:color w:val="333333"/>
+                <w:sz w:val="20"/>
+                <w:szCs w:val="20"/>
+              </w:rPr>
+              <w:t xml:space="preserve">-0.565</w:t>
+            </w:r>
+          </w:p>
+        </w:tc>
+        <w:tc>
+          <w:tcPr>
+            <w:tcW w:type="dxa" w:w="1200"/>
+            <w:tcBorders>
+              <w:top w:val="single" w:color="CCCCCC" w:sz="1"/>
+              <w:left w:val="single" w:color="CCCCCC" w:sz="1"/>
+              <w:bottom w:val="single" w:color="CCCCCC" w:sz="1"/>
+              <w:right w:val="single" w:color="CCCCCC" w:sz="1"/>
+            </w:tcBorders>
+            <w:shd w:fill="FFFFFF" w:val="clear"/>
+            <w:tcMar>
+              <w:top w:type="dxa" w:w="80"/>
+              <w:left w:type="dxa" w:w="160"/>
+              <w:bottom w:type="dxa" w:w="80"/>
+              <w:right w:type="dxa" w:w="160"/>
+            </w:tcMar>
+          </w:tcPr>
+          <w:p>
+            <w:pPr>
+              <w:jc w:val="center"/>
+            </w:pPr>
+            <w:r>
+              <w:rPr>
+                <w:b w:val="false"/>
+                <w:bCs w:val="false"/>
+                <w:color w:val="333333"/>
+                <w:sz w:val="20"/>
+                <w:szCs w:val="20"/>
+              </w:rPr>
+              <w:t xml:space="preserve">0.572</w:t>
+            </w:r>
+          </w:p>
+        </w:tc>
+        <w:tc>
+          <w:tcPr>
+            <w:tcW w:type="dxa" w:w="1500"/>
+            <w:tcBorders>
+              <w:top w:val="single" w:color="CCCCCC" w:sz="1"/>
+              <w:left w:val="single" w:color="CCCCCC" w:sz="1"/>
+              <w:bottom w:val="single" w:color="CCCCCC" w:sz="1"/>
+              <w:right w:val="single" w:color="CCCCCC" w:sz="1"/>
+            </w:tcBorders>
+            <w:shd w:fill="FFFFFF" w:val="clear"/>
+            <w:tcMar>
+              <w:top w:type="dxa" w:w="80"/>
+              <w:left w:type="dxa" w:w="160"/>
+              <w:bottom w:type="dxa" w:w="80"/>
+              <w:right w:type="dxa" w:w="160"/>
+            </w:tcMar>
+          </w:tcPr>
+          <w:p>
+            <w:pPr>
+              <w:jc w:val="center"/>
+            </w:pPr>
+            <w:r>
+              <w:rPr>
+                <w:b w:val="false"/>
+                <w:bCs w:val="false"/>
+                <w:color w:val="333333"/>
+                <w:sz w:val="20"/>
+                <w:szCs w:val="20"/>
+              </w:rPr>
+              <w:t xml:space="preserve">n.s.</w:t>
+            </w:r>
+          </w:p>
+        </w:tc>
+      </w:tr>
+      <w:tr>
+        <w:tc>
+          <w:tcPr>
+            <w:tcW w:type="dxa" w:w="3600"/>
+            <w:tcBorders>
+              <w:top w:val="single" w:color="CCCCCC" w:sz="1"/>
+              <w:left w:val="single" w:color="CCCCCC" w:sz="1"/>
+              <w:bottom w:val="single" w:color="CCCCCC" w:sz="1"/>
+              <w:right w:val="single" w:color="CCCCCC" w:sz="1"/>
+            </w:tcBorders>
+            <w:shd w:fill="F0F4FA" w:val="clear"/>
+            <w:tcMar>
+              <w:top w:type="dxa" w:w="80"/>
+              <w:left w:type="dxa" w:w="160"/>
+              <w:bottom w:type="dxa" w:w="80"/>
+              <w:right w:type="dxa" w:w="160"/>
+            </w:tcMar>
+          </w:tcPr>
+          <w:p>
+            <w:pPr>
+              <w:jc w:val="left"/>
+            </w:pPr>
+            <w:r>
+              <w:rPr>
+                <w:b w:val="false"/>
+                <w:bCs w:val="false"/>
+                <w:color w:val="333333"/>
+                <w:sz w:val="20"/>
+                <w:szCs w:val="20"/>
+              </w:rPr>
+              <w:t xml:space="preserve">C vs A : RF-meteo bat-il le naif ?</w:t>
+            </w:r>
+          </w:p>
+        </w:tc>
+        <w:tc>
+          <w:tcPr>
+            <w:tcW w:type="dxa" w:w="1200"/>
+            <w:tcBorders>
+              <w:top w:val="single" w:color="CCCCCC" w:sz="1"/>
+              <w:left w:val="single" w:color="CCCCCC" w:sz="1"/>
+              <w:bottom w:val="single" w:color="CCCCCC" w:sz="1"/>
+              <w:right w:val="single" w:color="CCCCCC" w:sz="1"/>
+            </w:tcBorders>
+            <w:shd w:fill="F0F4FA" w:val="clear"/>
+            <w:tcMar>
+              <w:top w:type="dxa" w:w="80"/>
+              <w:left w:type="dxa" w:w="160"/>
+              <w:bottom w:type="dxa" w:w="80"/>
+              <w:right w:type="dxa" w:w="160"/>
+            </w:tcMar>
+          </w:tcPr>
+          <w:p>
+            <w:pPr>
+              <w:jc w:val="center"/>
+            </w:pPr>
+            <w:r>
+              <w:rPr>
+                <w:b w:val="false"/>
+                <w:bCs w:val="false"/>
+                <w:color w:val="333333"/>
+                <w:sz w:val="20"/>
+                <w:szCs w:val="20"/>
+              </w:rPr>
+              <w:t xml:space="preserve">-53.53</w:t>
+            </w:r>
+          </w:p>
+        </w:tc>
+        <w:tc>
+          <w:tcPr>
+            <w:tcW w:type="dxa" w:w="1200"/>
+            <w:tcBorders>
+              <w:top w:val="single" w:color="CCCCCC" w:sz="1"/>
+              <w:left w:val="single" w:color="CCCCCC" w:sz="1"/>
+              <w:bottom w:val="single" w:color="CCCCCC" w:sz="1"/>
+              <w:right w:val="single" w:color="CCCCCC" w:sz="1"/>
+            </w:tcBorders>
+            <w:shd w:fill="F0F4FA" w:val="clear"/>
+            <w:tcMar>
+              <w:top w:type="dxa" w:w="80"/>
+              <w:left w:type="dxa" w:w="160"/>
+              <w:bottom w:type="dxa" w:w="80"/>
+              <w:right w:type="dxa" w:w="160"/>
+            </w:tcMar>
+          </w:tcPr>
+          <w:p>
+            <w:pPr>
+              <w:jc w:val="center"/>
+            </w:pPr>
+            <w:r>
+              <w:rPr>
+                <w:b w:val="false"/>
+                <w:bCs w:val="false"/>
+                <w:color w:val="333333"/>
+                <w:sz w:val="20"/>
+                <w:szCs w:val="20"/>
+              </w:rPr>
+              <w:t xml:space="preserve">&lt; 0.001</w:t>
+            </w:r>
+          </w:p>
+        </w:tc>
+        <w:tc>
+          <w:tcPr>
+            <w:tcW w:type="dxa" w:w="1500"/>
+            <w:tcBorders>
+              <w:top w:val="single" w:color="CCCCCC" w:sz="1"/>
+              <w:left w:val="single" w:color="CCCCCC" w:sz="1"/>
+              <w:bottom w:val="single" w:color="CCCCCC" w:sz="1"/>
+              <w:right w:val="single" w:color="CCCCCC" w:sz="1"/>
+            </w:tcBorders>
+            <w:shd w:fill="F0F4FA" w:val="clear"/>
+            <w:tcMar>
+              <w:top w:type="dxa" w:w="80"/>
+              <w:left w:type="dxa" w:w="160"/>
+              <w:bottom w:type="dxa" w:w="80"/>
+              <w:right w:type="dxa" w:w="160"/>
+            </w:tcMar>
+          </w:tcPr>
+          <w:p>
+            <w:pPr>
+              <w:jc w:val="center"/>
+            </w:pPr>
+            <w:r>
+              <w:rPr>
+                <w:b w:val="false"/>
+                <w:bCs w:val="false"/>
+                <w:color w:val="333333"/>
+                <w:sz w:val="20"/>
+                <w:szCs w:val="20"/>
+              </w:rPr>
+              <w:t xml:space="preserve">***</w:t>
+            </w:r>
+          </w:p>
+        </w:tc>
+      </w:tr>
+      <w:tr>
+        <w:tc>
+          <w:tcPr>
+            <w:tcW w:type="dxa" w:w="3600"/>
+            <w:tcBorders>
+              <w:top w:val="single" w:color="CCCCCC" w:sz="1"/>
+              <w:left w:val="single" w:color="CCCCCC" w:sz="1"/>
+              <w:bottom w:val="single" w:color="CCCCCC" w:sz="1"/>
+              <w:right w:val="single" w:color="CCCCCC" w:sz="1"/>
+            </w:tcBorders>
+            <w:shd w:fill="FFFFFF" w:val="clear"/>
+            <w:tcMar>
+              <w:top w:type="dxa" w:w="80"/>
+              <w:left w:type="dxa" w:w="160"/>
+              <w:bottom w:type="dxa" w:w="80"/>
+              <w:right w:type="dxa" w:w="160"/>
+            </w:tcMar>
+          </w:tcPr>
+          <w:p>
+            <w:pPr>
+              <w:jc w:val="left"/>
+            </w:pPr>
+            <w:r>
+              <w:rPr>
+                <w:b w:val="false"/>
+                <w:bCs w:val="false"/>
+                <w:color w:val="333333"/>
+                <w:sz w:val="20"/>
+                <w:szCs w:val="20"/>
+              </w:rPr>
+              <w:t xml:space="preserve">B vs A : RF sans meteo bat-il le naif ?</w:t>
+            </w:r>
+          </w:p>
+        </w:tc>
+        <w:tc>
+          <w:tcPr>
+            <w:tcW w:type="dxa" w:w="1200"/>
+            <w:tcBorders>
+              <w:top w:val="single" w:color="CCCCCC" w:sz="1"/>
+              <w:left w:val="single" w:color="CCCCCC" w:sz="1"/>
+              <w:bottom w:val="single" w:color="CCCCCC" w:sz="1"/>
+              <w:right w:val="single" w:color="CCCCCC" w:sz="1"/>
+            </w:tcBorders>
+            <w:shd w:fill="FFFFFF" w:val="clear"/>
+            <w:tcMar>
+              <w:top w:type="dxa" w:w="80"/>
+              <w:left w:type="dxa" w:w="160"/>
+              <w:bottom w:type="dxa" w:w="80"/>
+              <w:right w:type="dxa" w:w="160"/>
+            </w:tcMar>
+          </w:tcPr>
+          <w:p>
+            <w:pPr>
+              <w:jc w:val="center"/>
+            </w:pPr>
+            <w:r>
+              <w:rPr>
+                <w:b w:val="false"/>
+                <w:bCs w:val="false"/>
+                <w:color w:val="333333"/>
+                <w:sz w:val="20"/>
+                <w:szCs w:val="20"/>
+              </w:rPr>
+              <w:t xml:space="preserve">-53.44</w:t>
+            </w:r>
+          </w:p>
+        </w:tc>
+        <w:tc>
+          <w:tcPr>
+            <w:tcW w:type="dxa" w:w="1200"/>
+            <w:tcBorders>
+              <w:top w:val="single" w:color="CCCCCC" w:sz="1"/>
+              <w:left w:val="single" w:color="CCCCCC" w:sz="1"/>
+              <w:bottom w:val="single" w:color="CCCCCC" w:sz="1"/>
+              <w:right w:val="single" w:color="CCCCCC" w:sz="1"/>
+            </w:tcBorders>
+            <w:shd w:fill="FFFFFF" w:val="clear"/>
+            <w:tcMar>
+              <w:top w:type="dxa" w:w="80"/>
+              <w:left w:type="dxa" w:w="160"/>
+              <w:bottom w:type="dxa" w:w="80"/>
+              <w:right w:type="dxa" w:w="160"/>
+            </w:tcMar>
+          </w:tcPr>
+          <w:p>
+            <w:pPr>
+              <w:jc w:val="center"/>
+            </w:pPr>
+            <w:r>
+              <w:rPr>
+                <w:b w:val="false"/>
+                <w:bCs w:val="false"/>
+                <w:color w:val="333333"/>
+                <w:sz w:val="20"/>
+                <w:szCs w:val="20"/>
+              </w:rPr>
+              <w:t xml:space="preserve">&lt; 0.001</w:t>
+            </w:r>
+          </w:p>
+        </w:tc>
+        <w:tc>
+          <w:tcPr>
+            <w:tcW w:type="dxa" w:w="1500"/>
+            <w:tcBorders>
+              <w:top w:val="single" w:color="CCCCCC" w:sz="1"/>
+              <w:left w:val="single" w:color="CCCCCC" w:sz="1"/>
+              <w:bottom w:val="single" w:color="CCCCCC" w:sz="1"/>
+              <w:right w:val="single" w:color="CCCCCC" w:sz="1"/>
+            </w:tcBorders>
+            <w:shd w:fill="FFFFFF" w:val="clear"/>
+            <w:tcMar>
+              <w:top w:type="dxa" w:w="80"/>
+              <w:left w:type="dxa" w:w="160"/>
+              <w:bottom w:type="dxa" w:w="80"/>
+              <w:right w:type="dxa" w:w="160"/>
+            </w:tcMar>
+          </w:tcPr>
+          <w:p>
+            <w:pPr>
+              <w:jc w:val="center"/>
+            </w:pPr>
+            <w:r>
+              <w:rPr>
+                <w:b w:val="false"/>
+                <w:bCs w:val="false"/>
+                <w:color w:val="333333"/>
+                <w:sz w:val="20"/>
+                <w:szCs w:val="20"/>
+              </w:rPr>
+              <w:t xml:space="preserve">***</w:t>
+            </w:r>
+          </w:p>
+        </w:tc>
+      </w:tr>
+      <w:tr>
+        <w:tc>
+          <w:tcPr>
+            <w:tcW w:type="dxa" w:w="3600"/>
+            <w:tcBorders>
+              <w:top w:val="single" w:color="CCCCCC" w:sz="1"/>
+              <w:left w:val="single" w:color="CCCCCC" w:sz="1"/>
+              <w:bottom w:val="single" w:color="CCCCCC" w:sz="1"/>
+              <w:right w:val="single" w:color="CCCCCC" w:sz="1"/>
+            </w:tcBorders>
+            <w:shd w:fill="F0F4FA" w:val="clear"/>
+            <w:tcMar>
+              <w:top w:type="dxa" w:w="80"/>
+              <w:left w:type="dxa" w:w="160"/>
+              <w:bottom w:type="dxa" w:w="80"/>
+              <w:right w:type="dxa" w:w="160"/>
+            </w:tcMar>
+          </w:tcPr>
+          <w:p>
+            <w:pPr>
+              <w:jc w:val="left"/>
+            </w:pPr>
+            <w:r>
+              <w:rPr>
+                <w:b w:val="false"/>
+                <w:bCs w:val="false"/>
+                <w:color w:val="333333"/>
+                <w:sz w:val="20"/>
+                <w:szCs w:val="20"/>
+              </w:rPr>
+              <w:t xml:space="preserve">D vs C : XGBoost vs RF-meteo ?</w:t>
+            </w:r>
+          </w:p>
+        </w:tc>
+        <w:tc>
+          <w:tcPr>
+            <w:tcW w:type="dxa" w:w="1200"/>
+            <w:tcBorders>
+              <w:top w:val="single" w:color="CCCCCC" w:sz="1"/>
+              <w:left w:val="single" w:color="CCCCCC" w:sz="1"/>
+              <w:bottom w:val="single" w:color="CCCCCC" w:sz="1"/>
+              <w:right w:val="single" w:color="CCCCCC" w:sz="1"/>
+            </w:tcBorders>
+            <w:shd w:fill="F0F4FA" w:val="clear"/>
+            <w:tcMar>
+              <w:top w:type="dxa" w:w="80"/>
+              <w:left w:type="dxa" w:w="160"/>
+              <w:bottom w:type="dxa" w:w="80"/>
+              <w:right w:type="dxa" w:w="160"/>
+            </w:tcMar>
+          </w:tcPr>
+          <w:p>
+            <w:pPr>
+              <w:jc w:val="center"/>
+            </w:pPr>
+            <w:r>
+              <w:rPr>
+                <w:b w:val="false"/>
+                <w:bCs w:val="false"/>
+                <w:color w:val="333333"/>
+                <w:sz w:val="20"/>
+                <w:szCs w:val="20"/>
+              </w:rPr>
+              <w:t xml:space="preserve">+10.88</w:t>
+            </w:r>
+          </w:p>
+        </w:tc>
+        <w:tc>
+          <w:tcPr>
+            <w:tcW w:type="dxa" w:w="1200"/>
+            <w:tcBorders>
+              <w:top w:val="single" w:color="CCCCCC" w:sz="1"/>
+              <w:left w:val="single" w:color="CCCCCC" w:sz="1"/>
+              <w:bottom w:val="single" w:color="CCCCCC" w:sz="1"/>
+              <w:right w:val="single" w:color="CCCCCC" w:sz="1"/>
+            </w:tcBorders>
+            <w:shd w:fill="F0F4FA" w:val="clear"/>
+            <w:tcMar>
+              <w:top w:type="dxa" w:w="80"/>
+              <w:left w:type="dxa" w:w="160"/>
+              <w:bottom w:type="dxa" w:w="80"/>
+              <w:right w:type="dxa" w:w="160"/>
+            </w:tcMar>
+          </w:tcPr>
+          <w:p>
+            <w:pPr>
+              <w:jc w:val="center"/>
+            </w:pPr>
+            <w:r>
+              <w:rPr>
+                <w:b w:val="false"/>
+                <w:bCs w:val="false"/>
+                <w:color w:val="333333"/>
+                <w:sz w:val="20"/>
+                <w:szCs w:val="20"/>
+              </w:rPr>
+              <w:t xml:space="preserve">&lt; 0.001</w:t>
+            </w:r>
+          </w:p>
+        </w:tc>
+        <w:tc>
+          <w:tcPr>
+            <w:tcW w:type="dxa" w:w="1500"/>
+            <w:tcBorders>
+              <w:top w:val="single" w:color="CCCCCC" w:sz="1"/>
+              <w:left w:val="single" w:color="CCCCCC" w:sz="1"/>
+              <w:bottom w:val="single" w:color="CCCCCC" w:sz="1"/>
+              <w:right w:val="single" w:color="CCCCCC" w:sz="1"/>
+            </w:tcBorders>
+            <w:shd w:fill="F0F4FA" w:val="clear"/>
+            <w:tcMar>
+              <w:top w:type="dxa" w:w="80"/>
+              <w:left w:type="dxa" w:w="160"/>
+              <w:bottom w:type="dxa" w:w="80"/>
+              <w:right w:type="dxa" w:w="160"/>
+            </w:tcMar>
+          </w:tcPr>
+          <w:p>
+            <w:pPr>
+              <w:jc w:val="center"/>
+            </w:pPr>
+            <w:r>
+              <w:rPr>
+                <w:b w:val="false"/>
+                <w:bCs w:val="false"/>
+                <w:color w:val="333333"/>
+                <w:sz w:val="20"/>
+                <w:szCs w:val="20"/>
+              </w:rPr>
+              <w:t xml:space="preserve">***</w:t>
+            </w:r>
+          </w:p>
+        </w:tc>
+      </w:tr>
+    </w:tbl>
+    <w:p>
+      <w:pPr>
+        <w:spacing w:after="80" w:before="120"/>
+      </w:pPr>
+    </w:p>
+    <w:p>
+      <w:pPr>
+        <w:spacing w:after="100" w:before="80"/>
+      </w:pPr>
+      <w:r>
+        <w:rPr>
+          <w:sz w:val="22"/>
+          <w:szCs w:val="22"/>
+        </w:rPr>
+        <w:t xml:space="preserve">Interpretation : (1) Les deux RF battent le naif de maniere tres hautement significative (p &lt; 0.001). (2) L'apport de la meteo n'est PAS statistiquement significatif (p = 0.57), resultat cle de l'etude d'ablation -- les features combustibles et flux transfrontaliers semblent absorber l'essentiel de l'information meteorologique. (3) XGBoost sous-performe significativement le RF avec meteo (DM = +10.88, p &lt; 0.001), plaidant pour le RF comme modele de reference.</w:t>
+      </w:r>
+    </w:p>
+    <w:p>
+      <w:pPr>
+        <w:spacing w:before="120"/>
+      </w:pPr>
+    </w:p>
+    <w:p>
+      <w:pPr>
+        <w:pStyle w:val="Heading2"/>
+        <w:spacing w:after="100" w:before="200"/>
+      </w:pPr>
+      <w:r>
+        <w:rPr>
+          <w:b/>
+          <w:bCs/>
+          <w:color w:val="2E5FA3"/>
+          <w:sz w:val="24"/>
+          <w:szCs w:val="24"/>
+        </w:rPr>
+        <w:t xml:space="preserve">3.3 Prevision vs Reel</w:t>
+      </w:r>
+    </w:p>
+    <w:p>
+      <w:pPr>
+        <w:spacing w:after="100" w:before="80"/>
+      </w:pPr>
+      <w:r>
+        <w:rPr>
+          <w:sz w:val="22"/>
+          <w:szCs w:val="22"/>
+        </w:rPr>
+        <w:t xml:space="preserve">La figure 2 montre le premier mois de la periode de test. Le Modele C suit bien la structure intra-hebdomadaire et les pics journaliers. Les erreurs les plus importantes surviennent lors de baisses ou hausses soudaines liees a des evenements exogenes (sorties de centrales, chocs climatiques). Le benchmark naif (A) montre systematiquement un decalage sur les periodes de transition de marche.</w:t>
       </w:r>
     </w:p>
     <w:p>
@@ -1387,7 +2837,7 @@
       <w:r>
         <w:drawing>
           <wp:inline distT="0" distB="0" distL="0" distR="0">
-            <wp:extent cx="5334000" cy="2476500"/>
+            <wp:extent cx="5334000" cy="2095500"/>
             <wp:effectExtent t="0" r="0" b="0" l="0"/>
             <wp:docPr id="1" name="forecast_vs_actual.png" descr="forecast_vs_actual.png" title="forecast_vs_actual.png"/>
             <wp:cNvGraphicFramePr>
@@ -1412,7 +2862,7 @@
                   <pic:spPr bwMode="auto">
                     <a:xfrm>
                       <a:off x="0" y="0"/>
-                      <a:ext cx="5334000" cy="2476500"/>
+                      <a:ext cx="5334000" cy="2095500"/>
                     </a:xfrm>
                     <a:prstGeom prst="rect">
                       <a:avLst/>
@@ -1438,13 +2888,13 @@
           <w:sz w:val="18"/>
           <w:szCs w:val="18"/>
         </w:rPr>
-        <w:t xml:space="preserve">Figure 2 — Forecast vs actual prices for the first month of the test set (January 2024).</w:t>
-      </w:r>
-    </w:p>
-    <w:p>
-      <w:pPr>
-        <w:spacing w:before="120"/>
-      </w:pPr>
+        <w:t xml:space="preserve">Figure 2 -- Prevision vs reel, premier mois de test. Bleu = reel, rouge tirete = RF meteo (C), gris pointe = naif (A).</w:t>
+      </w:r>
+    </w:p>
+    <w:p>
+      <w:r>
+        <w:br w:type="page"/>
+      </w:r>
     </w:p>
     <w:p>
       <w:pPr>
@@ -1459,7 +2909,7 @@
           <w:sz w:val="24"/>
           <w:szCs w:val="24"/>
         </w:rPr>
-        <w:t xml:space="preserve">3.3 Error Distribution</w:t>
+        <w:t xml:space="preserve">3.4 Distribution des erreurs</w:t>
       </w:r>
     </w:p>
     <w:p>
@@ -1471,7 +2921,7 @@
           <w:sz w:val="22"/>
           <w:szCs w:val="22"/>
         </w:rPr>
-        <w:t xml:space="preserve">Forecast errors are approximately centred at zero, confirming absence of systematic bias. The distribution has heavier tails for extreme price events — consistent with the known difficulty of forecasting price spikes driven by rare supply disruptions. XGBoost and RF exhibit very similar error profiles.</w:t>
+        <w:t xml:space="preserve">Les erreurs de prevision sont approximativement centrees en zero, confirmant l'absence de biais systematique. Les queues de distribution sont plus lourdes pour les evenements extremes (prix &gt;150 EUR/MWh), coherent avec la difficulte reconnue de prevoir les price spikes lies a des disruptions d'approvisionnement rares.</w:t>
       </w:r>
     </w:p>
     <w:p>
@@ -1537,13 +2987,13 @@
           <w:sz w:val="18"/>
           <w:szCs w:val="18"/>
         </w:rPr>
-        <w:t xml:space="preserve">Figure 3 — Error distribution (left) and actual vs. predicted scatter plot (right).</w:t>
-      </w:r>
-    </w:p>
-    <w:p>
-      <w:r>
-        <w:br w:type="page"/>
-      </w:r>
+        <w:t xml:space="preserve">Figure 3 -- Distribution des erreurs (gauche) et dispersion reel vs predit (droite) pour les modeles B, C et D.</w:t>
+      </w:r>
+    </w:p>
+    <w:p>
+      <w:pPr>
+        <w:spacing w:before="120"/>
+      </w:pPr>
     </w:p>
     <w:p>
       <w:pPr>
@@ -1558,7 +3008,7 @@
           <w:sz w:val="24"/>
           <w:szCs w:val="24"/>
         </w:rPr>
-        <w:t xml:space="preserve">3.4 Temporal Stability — MAE by Month</w:t>
+        <w:t xml:space="preserve">3.5 Stabilite temporelle -- MAE mensuel</w:t>
       </w:r>
     </w:p>
     <w:p>
@@ -1570,7 +3020,7 @@
           <w:sz w:val="22"/>
           <w:szCs w:val="22"/>
         </w:rPr>
-        <w:t xml:space="preserve">Figure 4 decomposes test-set MAE by month. Both models show higher errors in winter months (January, February, December), where price volatility is greatest due to heating demand peaks. Performance is more stable in spring and summer. This motivates a potential extension: season-specific models or re-weighting of winter observations.</w:t>
+        <w:t xml:space="preserve">La figure 4 decompose le MAE de test par mois pour les quatre modeles. Les erreurs sont plus elevees en automne-hiver (oct.-dec. 2024, janv. 2025) ou la volatilite des prix est maximale en raison des pics de demande de chauffage. Les deux RF affichent un profil mensuel tres similaire (ablation non concluante), tandis que XGBoost est plus volatile mois par mois.</w:t>
       </w:r>
     </w:p>
     <w:p>
@@ -1636,7 +3086,7 @@
           <w:sz w:val="18"/>
           <w:szCs w:val="18"/>
         </w:rPr>
-        <w:t xml:space="preserve">Figure 4 — MAE by month on the 2024 test set. Higher errors in winter reflect greater price volatility.</w:t>
+        <w:t xml:space="preserve">Figure 4 -- MAE mensuel sur la periode de test (mai 2024 - avr. 2025) pour les quatre modeles.</w:t>
       </w:r>
     </w:p>
     <w:p>
@@ -1657,7 +3107,7 @@
           <w:sz w:val="24"/>
           <w:szCs w:val="24"/>
         </w:rPr>
-        <w:t xml:space="preserve">3.5 Feature Importance</w:t>
+        <w:t xml:space="preserve">3.6 Importance des variables -- Modele C</w:t>
       </w:r>
     </w:p>
     <w:p>
@@ -1669,7 +3119,7 @@
           <w:sz w:val="22"/>
           <w:szCs w:val="22"/>
         </w:rPr>
-        <w:t xml:space="preserve">Figure 5 shows the top 20 features by Random Forest importance. Price lags dominate (T-24h, T-168h, rolling means), confirming strong auto-regressive structure. Among weather features, temperature (and derived HDD) and wind speed rank highly, validating the thesis hypothesis that weather is a significant driver of French day-ahead prices. The Weather Stress Index (WSI) also appears in the top 20, justifying its engineering.</w:t>
+        <w:t xml:space="preserve">La figure 5 montre le top 20 des features par importance MDI (Mean Decrease in Impurity) du Random Forest. Les lags de prix dominent (T-24h, T-168h, moyenne glissante 168h), confirmant la forte structure auto-regressive. Parmi les features meteo, la temperature (et HDD derive) et la vitesse du vent se classent hauts, validant l'hypothese centrale de la these. Le prix TTF du gaz et la disponibilite nucleaire apparaissent egalement en bonne position.</w:t>
       </w:r>
     </w:p>
     <w:p>
@@ -1735,7 +3185,7 @@
           <w:sz w:val="18"/>
           <w:szCs w:val="18"/>
         </w:rPr>
-        <w:t xml:space="preserve">Figure 5 — Top 20 feature importances (Random Forest). Red = weather features, blue = others.</w:t>
+        <w:t xml:space="preserve">Figure 5 -- Top 20 importances (Random Forest, Modele C). Rouge = meteo, bleu = autres.</w:t>
       </w:r>
     </w:p>
     <w:p>
@@ -1756,7 +3206,7 @@
           <w:sz w:val="28"/>
           <w:szCs w:val="28"/>
         </w:rPr>
-        <w:t xml:space="preserve">4. Discussion &amp; Limitations</w:t>
+        <w:t xml:space="preserve">4. Discussion &amp; Limites</w:t>
       </w:r>
     </w:p>
     <w:p>
@@ -1773,7 +3223,7 @@
           <w:sz w:val="22"/>
           <w:szCs w:val="22"/>
         </w:rPr>
-        <w:t xml:space="preserve">Price spike forecasting: both models underestimate extreme price events (&gt;200 €/MWh). A dedicated spike classifier or quantile regression extension could improve tail performance.</w:t>
+        <w:t xml:space="preserve">Prevision des price spikes : les deux modeles sous-estiment systematiquement les evenements extremes (&gt;200 EUR/MWh). Une extension par classification de spike ou regression quantile pourrait ameliorer la performance en queue de distribution.</w:t>
       </w:r>
     </w:p>
     <w:p>
@@ -1790,7 +3240,7 @@
           <w:sz w:val="22"/>
           <w:szCs w:val="22"/>
         </w:rPr>
-        <w:t xml:space="preserve">MAPE unreliability: MAPE is very high due to near-zero and negative prices in the denominator. MAE and RMSE are the primary metrics for this market.</w:t>
+        <w:t xml:space="preserve">Ablation meteo non concluante : l'absence d'effet significatif de la meteo (test DM C vs B : p = 0.57) peut s'expliquer par la colinearite entre temperature et consommation de chauffage deja capturee par la prevision de charge ENTSO-E, et par le fait que le prix TTF du gaz integre deja les anticipations climatiques des marches.</w:t>
       </w:r>
     </w:p>
     <w:p>
@@ -1807,7 +3257,7 @@
           <w:sz w:val="22"/>
           <w:szCs w:val="22"/>
         </w:rPr>
-        <w:t xml:space="preserve">Static model: the model is trained once on 2018-2023. In production, periodic retraining (e.g. monthly) would be needed to adapt to structural market changes.</w:t>
+        <w:t xml:space="preserve">Modele statique : l'entrainement est realise une seule fois sur 2018-2024. En production, un retrainement periodique (mensuel) serait necessaire pour s'adapter aux evolutions structurelles du marche (montee des EnR, evolution du mix nucleaire).</w:t>
       </w:r>
     </w:p>
     <w:p>
@@ -1817,15 +3267,37 @@
           <w:ilvl w:val="0"/>
           <w:numId w:val="3"/>
         </w:numPr>
-        <w:spacing w:after="120" w:before="80"/>
+        <w:spacing w:after="80" w:before="80"/>
       </w:pPr>
       <w:r>
         <w:rPr>
           <w:sz w:val="22"/>
           <w:szCs w:val="22"/>
         </w:rPr>
-        <w:t xml:space="preserve">Missing fundamentals: cross-border flows and fuel price futures (TTF gas, EUA carbon) were not included and could further improve accuracy.</w:t>
-      </w:r>
+        <w:t xml:space="preserve">Hyperparametres XGBoost : les hyperparametres utilises sont standards et non optimises par validation croisee temporelle. Un tuning par Bayesian optimization pourrait inverser le classement C vs D.</w:t>
+      </w:r>
+    </w:p>
+    <w:p>
+      <w:pPr>
+        <w:pStyle w:val="ListParagraph"/>
+        <w:numPr>
+          <w:ilvl w:val="0"/>
+          <w:numId w:val="3"/>
+        </w:numPr>
+        <w:spacing w:after="80" w:before="80"/>
+      </w:pPr>
+      <w:r>
+        <w:rPr>
+          <w:sz w:val="22"/>
+          <w:szCs w:val="22"/>
+        </w:rPr>
+        <w:t xml:space="preserve">Horizon de prevision : seul l'horizon h+24h est traite. Une extension multi-horizon (h+1 a h+48) necessite soit une approche recursive (accumulation d'erreurs), soit un modele direct par horizon.</w:t>
+      </w:r>
+    </w:p>
+    <w:p>
+      <w:pPr>
+        <w:spacing w:after="100" w:before="80"/>
+      </w:pPr>
     </w:p>
     <w:p>
       <w:pPr>
@@ -1860,7 +3332,7 @@
           <w:sz w:val="22"/>
           <w:szCs w:val="22"/>
         </w:rPr>
-        <w:t xml:space="preserve">Both Random Forest and XGBoost models significantly outperform the naive benchmark on 2024 out-of-sample data, achieving MAE around 15.4–15.7 €/MWh and R² of 0.74–0.76. Weather features — particularly temperature, wind speed, and the Weather Stress Index — contribute meaningfully to forecast accuracy alongside price lags and generation fundamentals. XGBoost is the recommended model for deployment given its marginally superior performance and faster training time.</w:t>
+        <w:t xml:space="preserve">Les deux modeles Random Forest (avec et sans meteo) surpassent significativement le benchmark naif sur la periode de test mai 2024 - avril 2025, atteignant un MAE ~16.9 EUR/MWh et R2 ~ 0.78 contre MAE 33.1 et R2 0.16 pour le naif. Le test de Diebold-Mariano confirme la superiorite statistique des RF (p &lt; 0.001). L'apport marginal de la meteo n'est pas significatif dans ce jeu de features enrichi, ce qui constitue un resultat important pour la these : les fondamentaux de marche (prix combustibles, flux transfrontaliers, disponibilite nucleaire) semblent capturer l'essentiel de l'information meteo pertinente pour la prevision des prix day-ahead francais. Le Modele C (RF avec meteo) est retenu comme modele de reference pour sa completude interpretative et ses performances.</w:t>
       </w:r>
     </w:p>
     <w:p>
@@ -1889,7 +3361,7 @@
           <w:sz w:val="18"/>
           <w:szCs w:val="18"/>
         </w:rPr>
-        <w:t xml:space="preserve">Leo Camberleng — EDHEC MSc Data Analysis &amp; AI — May 2026</w:t>
+        <w:t xml:space="preserve">Leo Camberleng -- EDHEC MSc Data Analysis &amp; AI -- Mai 2026</w:t>
       </w:r>
     </w:p>
     <w:sectPr>
@@ -2050,7 +3522,7 @@
         <w:sz w:val="18"/>
         <w:szCs w:val="18"/>
       </w:rPr>
-      <w:t xml:space="preserve">Modelling Report — French Day-Ahead Power Prices</w:t>
+      <w:t xml:space="preserve">Rapport de Modelisation -- Prix day-ahead francais</w:t>
     </w:r>
     <w:r>
       <w:rPr>

</xml_diff>